<commit_message>
Remove Airbnb listing import claims from business docs
Onboarding is owner-provided content only (photo upload, AI-assisted
description, iCal calendar sync). We do not pull listing data or
photos from Airbnb. Updated business brief, competitive assessment,
and regenerated PDF and docx versions.

Co-Authored-By: Claude Opus 4.6 <noreply@anthropic.com>
</commit_message>
<xml_diff>
--- a/docs/business/Familiar_Guest_Business_Brief.docx
+++ b/docs/business/Familiar_Guest_Business_Brief.docx
@@ -56,7 +56,7 @@
         <w:pStyle w:val="MdParagraph"/>
       </w:pPr>
       <w:r>
-        <w:t xml:space="preserve">Familiar Guest is the simplest way for individual rental owners to take bookings directly from their own trusted guests — and, when they choose, from the public — without surrendering 15% or more, and the guest relationship, to Airbnb. Owners keep their existing listing exactly as it is, import it in minutes, and begin taking direct bookings under their own name, with payments, rental agreements, and trust safeguards handled automatically.</w:t>
+        <w:t xml:space="preserve">Familiar Guest is the simplest way for individual rental owners to take bookings directly from their own trusted guests — and, when they choose, from the public — without surrendering 15% or more, and the guest relationship, to Airbnb. Owners create a listing in minutes, sync their calendar, and begin taking direct bookings under their own name, with payments, rental agreements, and trust safeguards handled automatically.</w:t>
       </w:r>
     </w:p>
     <w:p>
@@ -69,7 +69,7 @@
         <w:pStyle w:val="MdParagraph"/>
       </w:pPr>
       <w:r>
-        <w:t xml:space="preserve">The product is built around one promise: near-zero effort to set up. We pull the owner's listing and photos from their existing Airbnb listing, sync their Airbnb calendar instantly, and verify their identity once — then they simply share a booking link.</w:t>
+        <w:t xml:space="preserve">The product is built around one promise: near-zero effort to set up. The owner uploads photos from their phone or cloud storage, answers a few quick questions (or pastes their own description and lets AI polish it), syncs their calendar via iCal, and verifies their identity once — then they simply share a booking link.</w:t>
       </w:r>
     </w:p>
     <w:p>
@@ -205,10 +205,10 @@
           <w:b/>
           <w:bCs/>
         </w:rPr>
-        <w:t xml:space="preserve">Import in minutes:</w:t>
-      </w:r>
-      <w:r>
-        <w:t xml:space="preserve"> pull listing details and photos straight from the owner's existing Airbnb listing — no retyping, no re-uploading.</w:t>
+        <w:t xml:space="preserve">Create your listing in minutes:</w:t>
+      </w:r>
+      <w:r>
+        <w:t xml:space="preserve"> upload photos from your phone, cloud storage (Google Photos, iCloud, Dropbox), or computer — then paste your own description or answer a few questions and let AI write one for you.</w:t>
       </w:r>
     </w:p>
     <w:p>
@@ -2162,7 +2162,7 @@
         <w:t xml:space="preserve">Build the core:</w:t>
       </w:r>
       <w:r>
-        <w:t xml:space="preserve"> Airbnb listing and photo import, instant iCal sync, Stripe-verified onboarding, a branded booking link, and payments with escrow.</w:t>
+        <w:t xml:space="preserve"> owner-driven listing creation (photo upload, AI description), iCal calendar sync, Stripe-verified onboarding, a branded booking link, and payments with escrow.</w:t>
       </w:r>
     </w:p>
     <w:p>

</xml_diff>

<commit_message>
Redesign business docs for executive presentation
Both the opportunity brief and competitive assessment now use
Familiar Guest brand styling (Fraunces/Hanken Grotesk typography,
forest green/terracotta/cream palette), stat callout boxes, card
layouts for competitor comparison, and confidential footers.
Regenerated PDF, docx, and owner invite.

Co-Authored-By: Claude Opus 4.6 <noreply@anthropic.com>
</commit_message>
<xml_diff>
--- a/docs/business/Familiar_Guest_Business_Brief.docx
+++ b/docs/business/Familiar_Guest_Business_Brief.docx
@@ -4,33 +4,6 @@
   <w:body>
     <w:p>
       <w:pPr>
-        <w:pStyle w:val="Heading1"/>
-        <w:pStyle w:val="MdHeading1"/>
-      </w:pPr>
-      <w:r>
-        <w:t xml:space="preserve">Familiar Guest — Business Opportunity Brief</w:t>
-      </w:r>
-    </w:p>
-    <w:p>
-      <w:pPr>
-        <w:pStyle w:val="MdParagraph"/>
-      </w:pPr>
-      <w:r>
-        <w:rPr>
-          <w:rStyle w:val="MdEm"/>
-          <w:i/>
-          <w:iCs/>
-        </w:rPr>
-        <w:t xml:space="preserve">Direct booking, made effortless for everyday rental owners</w:t>
-      </w:r>
-    </w:p>
-    <w:p>
-      <w:pPr>
-        <w:pStyle w:val="MdSpace"/>
-      </w:pPr>
-    </w:p>
-    <w:p>
-      <w:pPr>
         <w:pStyle w:val="MdHr"/>
         <w:pBdr>
           <w:bottom w:val="single" w:color="auto" w:sz="6" w:space="1"/>
@@ -39,8 +12,76 @@
     </w:p>
     <w:p>
       <w:pPr>
-        <w:pStyle w:val="MdSpace"/>
-      </w:pPr>
+        <w:pStyle w:val="MdParagraph"/>
+      </w:pPr>
+      <w:r>
+        <w:t xml:space="preserve">pdf_options:</w:t>
+      </w:r>
+      <w:r>
+        <w:br/>
+        <w:t xml:space="preserve">  margin:</w:t>
+      </w:r>
+      <w:r>
+        <w:br/>
+        <w:t xml:space="preserve">    top: 30mm</w:t>
+      </w:r>
+      <w:r>
+        <w:br/>
+        <w:t xml:space="preserve">    bottom: 25mm</w:t>
+      </w:r>
+      <w:r>
+        <w:br/>
+        <w:t xml:space="preserve">    left: 22mm</w:t>
+      </w:r>
+      <w:r>
+        <w:br/>
+        <w:t xml:space="preserve">    right: 22mm</w:t>
+      </w:r>
+      <w:r>
+        <w:br/>
+        <w:t xml:space="preserve">  displayHeaderFooter: true</w:t>
+      </w:r>
+      <w:r>
+        <w:br/>
+        <w:t xml:space="preserve">  headerTemplate: "</w:t>
+      </w:r>
+      <w:r>
+        <w:rPr>
+          <w:rStyle w:val="MdTag"/>
+        </w:rPr>
+        <w:t xml:space="preserve">&lt;span&gt;</w:t>
+      </w:r>
+      <w:r>
+        <w:rPr>
+          <w:rStyle w:val="MdTag"/>
+        </w:rPr>
+        <w:t xml:space="preserve">&lt;/span&gt;</w:t>
+      </w:r>
+      <w:r>
+        <w:t xml:space="preserve">"</w:t>
+      </w:r>
+      <w:r>
+        <w:br/>
+        <w:t xml:space="preserve">  footerTemplate: "</w:t>
+      </w:r>
+      <w:r>
+        <w:rPr>
+          <w:rStyle w:val="MdTag"/>
+        </w:rPr>
+        <w:t xml:space="preserve">&lt;div style='font-size:9px; color:#8a7e72; width:100%; text-align:center; padding:0 40px;'&gt;</w:t>
+      </w:r>
+      <w:r>
+        <w:t xml:space="preserve">Familiar Guest — Business Opportunity Brief &amp;nbsp;&amp;nbsp;|&amp;nbsp;&amp;nbsp; Confidential</w:t>
+      </w:r>
+      <w:r>
+        <w:rPr>
+          <w:rStyle w:val="MdTag"/>
+        </w:rPr>
+        <w:t xml:space="preserve">&lt;/div&gt;</w:t>
+      </w:r>
+      <w:r>
+        <w:t xml:space="preserve">"</w:t>
+      </w:r>
     </w:p>
     <w:p>
       <w:pPr>
@@ -48,34 +89,156 @@
         <w:pStyle w:val="MdHeading2"/>
       </w:pPr>
       <w:r>
-        <w:t xml:space="preserve">The Concept</w:t>
-      </w:r>
-    </w:p>
-    <w:p>
-      <w:pPr>
-        <w:pStyle w:val="MdParagraph"/>
-      </w:pPr>
-      <w:r>
-        <w:t xml:space="preserve">Familiar Guest is the simplest way for individual rental owners to take bookings directly from their own trusted guests — and, when they choose, from the public — without surrendering 15% or more, and the guest relationship, to Airbnb. Owners create a listing in minutes, sync their calendar, and begin taking direct bookings under their own name, with payments, rental agreements, and trust safeguards handled automatically.</w:t>
-      </w:r>
-    </w:p>
-    <w:p>
-      <w:pPr>
-        <w:pStyle w:val="MdSpace"/>
-      </w:pPr>
-    </w:p>
-    <w:p>
-      <w:pPr>
-        <w:pStyle w:val="MdParagraph"/>
-      </w:pPr>
-      <w:r>
-        <w:t xml:space="preserve">The product is built around one promise: near-zero effort to set up. The owner uploads photos from their phone or cloud storage, answers a few quick questions (or pastes their own description and lets AI polish it), syncs their calendar via iCal, and verifies their identity once — then they simply share a booking link.</w:t>
-      </w:r>
-    </w:p>
-    <w:p>
-      <w:pPr>
-        <w:pStyle w:val="MdSpace"/>
-      </w:pPr>
+        <w:t xml:space="preserve">stylesheet: </w:t>
+      </w:r>
+      <w:hyperlink w:history="1" r:id="rIduwumznkkobbdkevdrqmzk">
+        <w:r>
+          <w:rPr>
+            <w:rStyle w:val="MdLink"/>
+          </w:rPr>
+          <w:t xml:space="preserve">https://fonts.googleapis.com/css2?family=Fraunces:opsz,wght@9..144,400;9..144,600;9..144,700&amp;family=Hanken+Grotesk:wght@300;400;500;600&amp;display=swap</w:t>
+        </w:r>
+      </w:hyperlink>
+    </w:p>
+    <w:p>
+      <w:pPr>
+        <w:pStyle w:val="MdHtml"/>
+      </w:pPr>
+      <w:r>
+        <w:t xml:space="preserve">&lt;style&gt;</w:t>
+      </w:r>
+      <w:r>
+        <w:br/>
+        <w:t xml:space="preserve">  body { font-family: 'Hanken Grotesk', sans-serif; color: #2A241E; line-height: 1.65; font-size: 13px; }</w:t>
+      </w:r>
+      <w:r>
+        <w:br/>
+        <w:t xml:space="preserve">  h1, h2, h3 { font-family: 'Fraunces', serif; color: #14543F; }</w:t>
+      </w:r>
+      <w:r>
+        <w:br/>
+        <w:t xml:space="preserve">  h1 { font-size: 32px; margin-bottom: 2px; }</w:t>
+      </w:r>
+      <w:r>
+        <w:br/>
+        <w:t xml:space="preserve">  h2 { font-size: 19px; border-bottom: 2px solid #E6DBCB; padding-bottom: 6px; margin-top: 30px; }</w:t>
+      </w:r>
+      <w:r>
+        <w:br/>
+        <w:t xml:space="preserve">  h3 { font-size: 15px; color: #C0673E; margin-top: 18px; margin-bottom: 8px; }</w:t>
+      </w:r>
+      <w:r>
+        <w:br/>
+        <w:t xml:space="preserve">  table { font-size: 12px; border-collapse: collapse; width: 100%; margin: 14px 0; }</w:t>
+      </w:r>
+      <w:r>
+        <w:br/>
+        <w:t xml:space="preserve">  th { background-color: #14543F; color: white; padding: 8px 12px; text-align: left; font-weight: 500; }</w:t>
+      </w:r>
+      <w:r>
+        <w:br/>
+        <w:t xml:space="preserve">  td { padding: 8px 12px; border-bottom: 1px solid #E6DBCB; }</w:t>
+      </w:r>
+      <w:r>
+        <w:br/>
+        <w:t xml:space="preserve">  tr:nth-child(even) { background-color: #FBF6EE; }</w:t>
+      </w:r>
+      <w:r>
+        <w:br/>
+        <w:t xml:space="preserve">  .subtitle { font-family: 'Hanken Grotesk', sans-serif; font-size: 16px; color: #C0673E; font-weight: 500; margin-bottom: 20px; }</w:t>
+      </w:r>
+      <w:r>
+        <w:br/>
+        <w:t xml:space="preserve">  .lead { font-size: 14.5px; line-height: 1.7; color: #3d362e; }</w:t>
+      </w:r>
+      <w:r>
+        <w:br/>
+        <w:t xml:space="preserve">  .callout { background-color: #FBF6EE; border-left: 4px solid #14543F; padding: 14px 18px; margin: 18px 0; border-radius: 0 6px 6px 0; }</w:t>
+      </w:r>
+      <w:r>
+        <w:br/>
+        <w:t xml:space="preserve">  .callout p { margin: 4px 0; }</w:t>
+      </w:r>
+      <w:r>
+        <w:br/>
+        <w:t xml:space="preserve">  .stat-row { display: flex; justify-content: space-between; margin: 20px 0; }</w:t>
+      </w:r>
+      <w:r>
+        <w:br/>
+        <w:t xml:space="preserve">  .stat-box { text-align: center; flex: 1; padding: 16px 8px; }</w:t>
+      </w:r>
+      <w:r>
+        <w:br/>
+        <w:t xml:space="preserve">  .stat-number { font-family: 'Fraunces', serif; font-size: 28px; color: #14543F; font-weight: 700; }</w:t>
+      </w:r>
+      <w:r>
+        <w:br/>
+        <w:t xml:space="preserve">  .stat-label { font-size: 11px; color: #8a7e72; text-transform: uppercase; letter-spacing: 0.5px; margin-top: 4px; }</w:t>
+      </w:r>
+      <w:r>
+        <w:br/>
+        <w:t xml:space="preserve">  blockquote { border-left: 3px solid #C0673E; padding-left: 16px; color: #5a5047; font-style: italic; margin: 16px 0; }</w:t>
+      </w:r>
+      <w:r>
+        <w:br/>
+        <w:t xml:space="preserve">  strong { color: #14543F; }</w:t>
+      </w:r>
+      <w:r>
+        <w:br/>
+        <w:t xml:space="preserve">  hr { border: none; border-top: 1px solid #E6DBCB; margin: 28px 0; }</w:t>
+      </w:r>
+      <w:r>
+        <w:br/>
+        <w:t xml:space="preserve">  ul { padding-left: 20px; }</w:t>
+      </w:r>
+      <w:r>
+        <w:br/>
+        <w:t xml:space="preserve">  li { margin-bottom: 6px; }</w:t>
+      </w:r>
+      <w:r>
+        <w:br/>
+        <w:t xml:space="preserve">  .page-break { page-break-before: always; }</w:t>
+      </w:r>
+      <w:r>
+        <w:br/>
+        <w:t xml:space="preserve">&lt;/style&gt;</w:t>
+      </w:r>
+    </w:p>
+    <w:p>
+      <w:pPr>
+        <w:pStyle w:val="Heading1"/>
+        <w:pStyle w:val="MdHeading1"/>
+      </w:pPr>
+      <w:r>
+        <w:t xml:space="preserve">Familiar Guest</w:t>
+      </w:r>
+    </w:p>
+    <w:p>
+      <w:pPr>
+        <w:pStyle w:val="MdHtml"/>
+      </w:pPr>
+      <w:r>
+        <w:t xml:space="preserve">&lt;div class="subtitle"&gt;Direct booking, made effortless for everyday rental owners&lt;/div&gt;
+</w:t>
+      </w:r>
+    </w:p>
+    <w:p>
+      <w:pPr>
+        <w:pStyle w:val="MdHtml"/>
+      </w:pPr>
+      <w:r>
+        <w:t xml:space="preserve">&lt;p class="lead"&gt;Familiar Guest is the simplest way for individual vacation rental owners to take bookings directly from their own trusted guests — without surrendering 15% and the guest relationship to Airbnb.&lt;/p&gt;
+</w:t>
+      </w:r>
+    </w:p>
+    <w:p>
+      <w:pPr>
+        <w:pStyle w:val="MdHtml"/>
+      </w:pPr>
+      <w:r>
+        <w:t xml:space="preserve">&lt;p class="lead"&gt;Owners create a listing in minutes, sync their calendar, and share a branded booking link. Payments, rental agreements, and trust protections are handled automatically. The guest never sees our brand — only the owner's.&lt;/p&gt;
+</w:t>
+      </w:r>
     </w:p>
     <w:p>
       <w:pPr>
@@ -97,6 +260,66 @@
       </w:pPr>
       <w:r>
         <w:t xml:space="preserve">The Opportunity</w:t>
+      </w:r>
+    </w:p>
+    <w:p>
+      <w:pPr>
+        <w:pStyle w:val="MdHtml"/>
+      </w:pPr>
+      <w:r>
+        <w:t xml:space="preserve">&lt;div class="stat-row"&gt;</w:t>
+      </w:r>
+      <w:r>
+        <w:br/>
+        <w:t xml:space="preserve">  &lt;div class="stat-box"&gt;</w:t>
+      </w:r>
+      <w:r>
+        <w:br/>
+        <w:t xml:space="preserve">    &lt;div class="stat-number"&gt;$65–70B&lt;/div&gt;</w:t>
+      </w:r>
+      <w:r>
+        <w:br/>
+        <w:t xml:space="preserve">    &lt;div class="stat-label"&gt;U.S. &amp; Mexico rental market&lt;/div&gt;</w:t>
+      </w:r>
+      <w:r>
+        <w:br/>
+        <w:t xml:space="preserve">  &lt;/div&gt;</w:t>
+      </w:r>
+      <w:r>
+        <w:br/>
+        <w:t xml:space="preserve">  &lt;div class="stat-box"&gt;</w:t>
+      </w:r>
+      <w:r>
+        <w:br/>
+        <w:t xml:space="preserve">    &lt;div class="stat-number"&gt;25–30%&lt;/div&gt;</w:t>
+      </w:r>
+      <w:r>
+        <w:br/>
+        <w:t xml:space="preserve">    &lt;div class="stat-label"&gt;Bookings from repeat guests&lt;/div&gt;</w:t>
+      </w:r>
+      <w:r>
+        <w:br/>
+        <w:t xml:space="preserve">  &lt;/div&gt;</w:t>
+      </w:r>
+      <w:r>
+        <w:br/>
+        <w:t xml:space="preserve">  &lt;div class="stat-box"&gt;</w:t>
+      </w:r>
+      <w:r>
+        <w:br/>
+        <w:t xml:space="preserve">    &lt;div class="stat-number"&gt;$9–13B&lt;/div&gt;</w:t>
+      </w:r>
+      <w:r>
+        <w:br/>
+        <w:t xml:space="preserve">    &lt;div class="stat-label"&gt;Direct-bookable volume&lt;/div&gt;</w:t>
+      </w:r>
+      <w:r>
+        <w:br/>
+        <w:t xml:space="preserve">  &lt;/div&gt;</w:t>
+      </w:r>
+      <w:r>
+        <w:br/>
+        <w:t xml:space="preserve">&lt;/div&gt;</w:t>
       </w:r>
     </w:p>
     <w:p>
@@ -109,7 +332,15 @@
         </w:numPr>
       </w:pPr>
       <w:r>
-        <w:t xml:space="preserve">The U.S. and Mexico short-term rental market represents roughly $65-$70 billion in annual gross booking value.</w:t>
+        <w:rPr>
+          <w:rStyle w:val="MdStrong"/>
+          <w:b/>
+          <w:bCs/>
+        </w:rPr>
+        <w:t xml:space="preserve">Airbnb's 15.5% host fee</w:t>
+      </w:r>
+      <w:r>
+        <w:t xml:space="preserve"> and the loss of guest contact information create a strong financial and relational motive for owners to go direct with guests they already know.</w:t>
       </w:r>
     </w:p>
     <w:p>
@@ -122,7 +353,15 @@
         </w:numPr>
       </w:pPr>
       <w:r>
-        <w:t xml:space="preserve">About 25-30% of an active owner's bookings are repeat or referral guests — the type that can move to direct booking — putting realistically direct-bookable volume near $9-$13 billion.</w:t>
+        <w:rPr>
+          <w:rStyle w:val="MdStrong"/>
+          <w:b/>
+          <w:bCs/>
+        </w:rPr>
+        <w:t xml:space="preserve">Airbnb's AirCover does not apply off-platform</w:t>
+      </w:r>
+      <w:r>
+        <w:t xml:space="preserve">, leaving a trust gap that casual tools (Venmo, email) cannot fill. Familiar Guest closes that gap.</w:t>
       </w:r>
     </w:p>
     <w:p>
@@ -135,89 +374,88 @@
         </w:numPr>
       </w:pPr>
       <w:r>
-        <w:t xml:space="preserve">Airbnb's shift to a host fee of roughly 15.5%, and the fact that its AirCover protection does not apply to off-platform bookings, create both the financial motive to go direct and the trust gap we close.</w:t>
-      </w:r>
-    </w:p>
-    <w:p>
-      <w:pPr>
-        <w:pStyle w:val="ListParagraph"/>
-        <w:pStyle w:val="MdListItem"/>
-        <w:numPr>
-          <w:ilvl w:val="0"/>
-          <w:numId w:val="1"/>
-        </w:numPr>
-      </w:pPr>
-      <w:r>
-        <w:t xml:space="preserve">Existing tools (OwnerRez, Lodgify, Hostaway) are built for professional operators. No one cleanly serves the casual owner who simply wants a simple, trustworthy way to take repeat guests direct.</w:t>
-      </w:r>
-    </w:p>
-    <w:p>
-      <w:pPr>
-        <w:pStyle w:val="MdSpace"/>
-      </w:pPr>
-    </w:p>
-    <w:p>
-      <w:pPr>
-        <w:pStyle w:val="MdHr"/>
-        <w:pBdr>
-          <w:bottom w:val="single" w:color="auto" w:sz="6" w:space="1"/>
-        </w:pBdr>
-      </w:pPr>
-    </w:p>
-    <w:p>
-      <w:pPr>
-        <w:pStyle w:val="MdSpace"/>
-      </w:pPr>
-    </w:p>
-    <w:p>
-      <w:pPr>
-        <w:pStyle w:val="Heading2"/>
-        <w:pStyle w:val="MdHeading2"/>
-      </w:pPr>
-      <w:r>
-        <w:t xml:space="preserve">How It Works — Effortless Onboarding</w:t>
-      </w:r>
-    </w:p>
-    <w:p>
-      <w:pPr>
-        <w:pStyle w:val="MdParagraph"/>
-      </w:pPr>
-      <w:r>
-        <w:t xml:space="preserve">Our entire go-to-market depends on removing effort. The owner's path to a live direct-booking link has four short steps:</w:t>
-      </w:r>
-    </w:p>
-    <w:p>
-      <w:pPr>
-        <w:pStyle w:val="MdSpace"/>
-      </w:pPr>
-    </w:p>
-    <w:p>
-      <w:pPr>
-        <w:pStyle w:val="MdListItem"/>
-        <w:numPr>
-          <w:ilvl w:val="0"/>
-          <w:numId w:val="2"/>
-        </w:numPr>
-      </w:pPr>
-      <w:r>
         <w:rPr>
           <w:rStyle w:val="MdStrong"/>
           <w:b/>
           <w:bCs/>
         </w:rPr>
-        <w:t xml:space="preserve">Create your listing in minutes:</w:t>
-      </w:r>
-      <w:r>
-        <w:t xml:space="preserve"> upload photos from your phone, cloud storage (Google Photos, iCloud, Dropbox), or computer — then paste your own description or answer a few questions and let AI write one for you.</w:t>
-      </w:r>
-    </w:p>
-    <w:p>
-      <w:pPr>
-        <w:pStyle w:val="MdListItem"/>
-        <w:numPr>
-          <w:ilvl w:val="0"/>
-          <w:numId w:val="2"/>
-        </w:numPr>
+        <w:t xml:space="preserve">Existing direct-booking tools are built for professional operators.</w:t>
+      </w:r>
+      <w:r>
+        <w:t xml:space="preserve"> OwnerRez, Lodgify, and Hostaway require significant setup and technical comfort. No one cleanly serves the casual owner who just wants to take repeat guests direct.</w:t>
+      </w:r>
+    </w:p>
+    <w:p>
+      <w:pPr>
+        <w:pStyle w:val="MdSpace"/>
+      </w:pPr>
+    </w:p>
+    <w:p>
+      <w:pPr>
+        <w:pStyle w:val="MdHr"/>
+        <w:pBdr>
+          <w:bottom w:val="single" w:color="auto" w:sz="6" w:space="1"/>
+        </w:pBdr>
+      </w:pPr>
+    </w:p>
+    <w:p>
+      <w:pPr>
+        <w:pStyle w:val="MdSpace"/>
+      </w:pPr>
+    </w:p>
+    <w:p>
+      <w:pPr>
+        <w:pStyle w:val="Heading2"/>
+        <w:pStyle w:val="MdHeading2"/>
+      </w:pPr>
+      <w:r>
+        <w:t xml:space="preserve">How It Works</w:t>
+      </w:r>
+    </w:p>
+    <w:p>
+      <w:pPr>
+        <w:pStyle w:val="MdParagraph"/>
+      </w:pPr>
+      <w:r>
+        <w:t xml:space="preserve">An owner goes from zero to a live booking link in under an afternoon:</w:t>
+      </w:r>
+    </w:p>
+    <w:p>
+      <w:pPr>
+        <w:pStyle w:val="MdSpace"/>
+      </w:pPr>
+    </w:p>
+    <w:p>
+      <w:pPr>
+        <w:pStyle w:val="MdHtml"/>
+      </w:pPr>
+      <w:r>
+        <w:t xml:space="preserve">&lt;div class="callout"&gt;</w:t>
+      </w:r>
+      <w:r>
+        <w:br/>
+        <w:t xml:space="preserve">&lt;p&gt;&lt;strong&gt;1. Create your listing&lt;/strong&gt; — Upload photos from your phone or cloud storage (Google Photos, iCloud, Dropbox). Paste your own description or answer a few questions and let AI write one for you.&lt;/p&gt;</w:t>
+      </w:r>
+      <w:r>
+        <w:br/>
+        <w:t xml:space="preserve">&lt;p&gt;&lt;strong&gt;2. Sync your calendar&lt;/strong&gt; — Connect your Airbnb, VRBO, or any platform calendar via iCal. Availability stays current automatically.&lt;/p&gt;</w:t>
+      </w:r>
+      <w:r>
+        <w:br/>
+        <w:t xml:space="preserve">&lt;p&gt;&lt;strong&gt;3. Verify your identity&lt;/strong&gt; — A quick, Stripe-powered check (most owners clear in under five minutes). This is what earns the "Verified Owner" badge your guests see.&lt;/p&gt;</w:t>
+      </w:r>
+      <w:r>
+        <w:br/>
+        <w:t xml:space="preserve">&lt;p&gt;&lt;strong&gt;4. Share your link&lt;/strong&gt; — Text it, email it, post it. Your guest books, signs the rental agreement, and pays — all in one flow, on their phone.&lt;/p&gt;</w:t>
+      </w:r>
+      <w:r>
+        <w:br/>
+        <w:t xml:space="preserve">&lt;/div&gt;</w:t>
+      </w:r>
+    </w:p>
+    <w:p>
+      <w:pPr>
+        <w:pStyle w:val="MdParagraph"/>
       </w:pPr>
       <w:r>
         <w:rPr>
@@ -225,50 +463,7 @@
           <w:b/>
           <w:bCs/>
         </w:rPr>
-        <w:t xml:space="preserve">Instant calendar sync:</w:t>
-      </w:r>
-      <w:r>
-        <w:t xml:space="preserve"> connect the Airbnb calendar via iCal on day one so availability stays current and double-bookings are prevented.</w:t>
-      </w:r>
-    </w:p>
-    <w:p>
-      <w:pPr>
-        <w:pStyle w:val="MdListItem"/>
-        <w:numPr>
-          <w:ilvl w:val="0"/>
-          <w:numId w:val="2"/>
-        </w:numPr>
-      </w:pPr>
-      <w:r>
-        <w:rPr>
-          <w:rStyle w:val="MdStrong"/>
-          <w:b/>
-          <w:bCs/>
-        </w:rPr>
-        <w:t xml:space="preserve">Verify once:</w:t>
-      </w:r>
-      <w:r>
-        <w:t xml:space="preserve"> a short, Stripe-backed identity check (legal name, date of birth, address, last four of SSN, and a payout account) that most owners clear in minutes — presented under Familiar Guest branding.</w:t>
-      </w:r>
-    </w:p>
-    <w:p>
-      <w:pPr>
-        <w:pStyle w:val="MdListItem"/>
-        <w:numPr>
-          <w:ilvl w:val="0"/>
-          <w:numId w:val="2"/>
-        </w:numPr>
-      </w:pPr>
-      <w:r>
-        <w:rPr>
-          <w:rStyle w:val="MdStrong"/>
-          <w:b/>
-          <w:bCs/>
-        </w:rPr>
-        <w:t xml:space="preserve">Share and book:</w:t>
-      </w:r>
-      <w:r>
-        <w:t xml:space="preserve"> the owner sends a branded booking link to their guests; payment, the rental agreement, and the digital house manual are handled automatically.</w:t>
+        <w:t xml:space="preserve">No website to build. No software to learn. No guest account required.</w:t>
       </w:r>
     </w:p>
     <w:p>
@@ -295,7 +490,7 @@
         <w:pStyle w:val="MdHeading2"/>
       </w:pPr>
       <w:r>
-        <w:t xml:space="preserve">Plans We Offer</w:t>
+        <w:t xml:space="preserve">Trust — The Core Differentiator</w:t>
       </w:r>
     </w:p>
     <w:p>
@@ -303,7 +498,283 @@
         <w:pStyle w:val="MdParagraph"/>
       </w:pPr>
       <w:r>
-        <w:t xml:space="preserve">All owners must pass Stripe identity verification before listing a property or collecting payment — no exceptions. Card processing is passed through to owners at cost on every plan.</w:t>
+        <w:t xml:space="preserve">Direct booking between individuals has always had a trust problem. Familiar Guest solves it with infrastructure that neither Venmo nor a personal website can offer:</w:t>
+      </w:r>
+    </w:p>
+    <w:p>
+      <w:pPr>
+        <w:pStyle w:val="MdSpace"/>
+      </w:pPr>
+    </w:p>
+    <w:tbl>
+      <w:tblPr>
+        <w:tblStyle w:val="MdTable"/>
+        <w:tblW w:type="pct" w:w="100%"/>
+        <w:tblBorders>
+          <w:top w:val="single" w:color="auto" w:sz="4"/>
+          <w:left w:val="single" w:color="auto" w:sz="4"/>
+          <w:bottom w:val="single" w:color="auto" w:sz="4"/>
+          <w:right w:val="single" w:color="auto" w:sz="4"/>
+          <w:insideH w:val="single" w:color="auto" w:sz="4"/>
+          <w:insideV w:val="single" w:color="auto" w:sz="4"/>
+        </w:tblBorders>
+      </w:tblPr>
+      <w:tblGrid>
+        <w:gridCol w:w="5000"/>
+        <w:gridCol w:w="5000"/>
+      </w:tblGrid>
+      <w:tr>
+        <w:trPr>
+          <w:cantSplit/>
+          <w:tblHeader/>
+        </w:trPr>
+        <w:tc>
+          <w:tcPr>
+            <w:shd w:fill="F2F2F2"/>
+            <w:vAlign w:val="center"/>
+          </w:tcPr>
+          <w:p>
+            <w:pPr>
+              <w:pStyle w:val="MdTableHeader"/>
+            </w:pPr>
+            <w:r>
+              <w:t xml:space="preserve">Protection</w:t>
+            </w:r>
+          </w:p>
+        </w:tc>
+        <w:tc>
+          <w:tcPr>
+            <w:shd w:fill="F2F2F2"/>
+            <w:vAlign w:val="center"/>
+          </w:tcPr>
+          <w:p>
+            <w:pPr>
+              <w:pStyle w:val="MdTableHeader"/>
+            </w:pPr>
+            <w:r>
+              <w:t xml:space="preserve">What it does</w:t>
+            </w:r>
+          </w:p>
+        </w:tc>
+      </w:tr>
+      <w:tr>
+        <w:trPr>
+          <w:cantSplit/>
+        </w:trPr>
+        <w:tc>
+          <w:tcPr>
+            <w:vAlign w:val="center"/>
+          </w:tcPr>
+          <w:p>
+            <w:pPr>
+              <w:pStyle w:val="MdTableCell"/>
+            </w:pPr>
+            <w:r>
+              <w:rPr>
+                <w:rStyle w:val="MdStrong"/>
+                <w:b/>
+                <w:bCs/>
+              </w:rPr>
+              <w:t xml:space="preserve">Escrow</w:t>
+            </w:r>
+          </w:p>
+        </w:tc>
+        <w:tc>
+          <w:tcPr>
+            <w:vAlign w:val="center"/>
+          </w:tcPr>
+          <w:p>
+            <w:pPr>
+              <w:pStyle w:val="MdTableCell"/>
+            </w:pPr>
+            <w:r>
+              <w:t xml:space="preserve">Guest funds are held until check-in — not released early. Neither party can disappear with the money.</w:t>
+            </w:r>
+          </w:p>
+        </w:tc>
+      </w:tr>
+      <w:tr>
+        <w:trPr>
+          <w:cantSplit/>
+        </w:trPr>
+        <w:tc>
+          <w:tcPr>
+            <w:vAlign w:val="center"/>
+          </w:tcPr>
+          <w:p>
+            <w:pPr>
+              <w:pStyle w:val="MdTableCell"/>
+            </w:pPr>
+            <w:r>
+              <w:rPr>
+                <w:rStyle w:val="MdStrong"/>
+                <w:b/>
+                <w:bCs/>
+              </w:rPr>
+              <w:t xml:space="preserve">Verified Owner</w:t>
+            </w:r>
+          </w:p>
+        </w:tc>
+        <w:tc>
+          <w:tcPr>
+            <w:vAlign w:val="center"/>
+          </w:tcPr>
+          <w:p>
+            <w:pPr>
+              <w:pStyle w:val="MdTableCell"/>
+            </w:pPr>
+            <w:r>
+              <w:t xml:space="preserve">Every owner is identity-verified through Stripe as a condition of receiving payouts.</w:t>
+            </w:r>
+          </w:p>
+        </w:tc>
+      </w:tr>
+      <w:tr>
+        <w:trPr>
+          <w:cantSplit/>
+        </w:trPr>
+        <w:tc>
+          <w:tcPr>
+            <w:vAlign w:val="center"/>
+          </w:tcPr>
+          <w:p>
+            <w:pPr>
+              <w:pStyle w:val="MdTableCell"/>
+            </w:pPr>
+            <w:r>
+              <w:rPr>
+                <w:rStyle w:val="MdStrong"/>
+                <w:b/>
+                <w:bCs/>
+              </w:rPr>
+              <w:t xml:space="preserve">Rental Agreement</w:t>
+            </w:r>
+          </w:p>
+        </w:tc>
+        <w:tc>
+          <w:tcPr>
+            <w:vAlign w:val="center"/>
+          </w:tcPr>
+          <w:p>
+            <w:pPr>
+              <w:pStyle w:val="MdTableCell"/>
+            </w:pPr>
+            <w:r>
+              <w:t xml:space="preserve">Auto-generated per booking, digitally signed, permanently stored. No PDF email chains.</w:t>
+            </w:r>
+          </w:p>
+        </w:tc>
+      </w:tr>
+      <w:tr>
+        <w:trPr>
+          <w:cantSplit/>
+        </w:trPr>
+        <w:tc>
+          <w:tcPr>
+            <w:vAlign w:val="center"/>
+          </w:tcPr>
+          <w:p>
+            <w:pPr>
+              <w:pStyle w:val="MdTableCell"/>
+            </w:pPr>
+            <w:r>
+              <w:rPr>
+                <w:rStyle w:val="MdStrong"/>
+                <w:b/>
+                <w:bCs/>
+              </w:rPr>
+              <w:t xml:space="preserve">Damage Deposit</w:t>
+            </w:r>
+          </w:p>
+        </w:tc>
+        <w:tc>
+          <w:tcPr>
+            <w:vAlign w:val="center"/>
+          </w:tcPr>
+          <w:p>
+            <w:pPr>
+              <w:pStyle w:val="MdTableCell"/>
+            </w:pPr>
+            <w:r>
+              <w:t xml:space="preserve">Held separately, released automatically after the owner's inspection window.</w:t>
+            </w:r>
+          </w:p>
+        </w:tc>
+      </w:tr>
+      <w:tr>
+        <w:trPr>
+          <w:cantSplit/>
+        </w:trPr>
+        <w:tc>
+          <w:tcPr>
+            <w:vAlign w:val="center"/>
+          </w:tcPr>
+          <w:p>
+            <w:pPr>
+              <w:pStyle w:val="MdTableCell"/>
+            </w:pPr>
+            <w:r>
+              <w:rPr>
+                <w:rStyle w:val="MdStrong"/>
+                <w:b/>
+                <w:bCs/>
+              </w:rPr>
+              <w:t xml:space="preserve">Guest Screening</w:t>
+            </w:r>
+          </w:p>
+        </w:tc>
+        <w:tc>
+          <w:tcPr>
+            <w:vAlign w:val="center"/>
+          </w:tcPr>
+          <w:p>
+            <w:pPr>
+              <w:pStyle w:val="MdTableCell"/>
+            </w:pPr>
+            <w:r>
+              <w:t xml:space="preserve">Optional ID and fraud check for bookings from guests the owner doesn't yet know.</w:t>
+            </w:r>
+          </w:p>
+        </w:tc>
+      </w:tr>
+    </w:tbl>
+    <w:p>
+      <w:pPr>
+        <w:pStyle w:val="MdBlockquote"/>
+      </w:pPr>
+      <w:r>
+        <w:t xml:space="preserve">Escrow is the single most important trust feature. It transforms "send money to a stranger" into "your funds are protected until you arrive."</w:t>
+      </w:r>
+    </w:p>
+    <w:p>
+      <w:pPr>
+        <w:pStyle w:val="MdSpace"/>
+      </w:pPr>
+    </w:p>
+    <w:p>
+      <w:pPr>
+        <w:pStyle w:val="MdHtml"/>
+      </w:pPr>
+      <w:r>
+        <w:t xml:space="preserve">&lt;div class="page-break"&gt;&lt;/div&gt;
+</w:t>
+      </w:r>
+    </w:p>
+    <w:p>
+      <w:pPr>
+        <w:pStyle w:val="Heading2"/>
+        <w:pStyle w:val="MdHeading2"/>
+      </w:pPr>
+      <w:r>
+        <w:t xml:space="preserve">Plans &amp; Pricing</w:t>
+      </w:r>
+    </w:p>
+    <w:p>
+      <w:pPr>
+        <w:pStyle w:val="MdParagraph"/>
+      </w:pPr>
+      <w:r>
+        <w:t xml:space="preserve">All owners must pass identity verification before listing a property or collecting payment. Card processing fees are passed through at cost on every plan — we never mark them up.</w:t>
       </w:r>
     </w:p>
     <w:p>
@@ -358,7 +829,7 @@
               <w:pStyle w:val="MdTableHeader"/>
             </w:pPr>
             <w:r>
-              <w:t xml:space="preserve">Pricing</w:t>
+              <w:t xml:space="preserve">Price</w:t>
             </w:r>
           </w:p>
         </w:tc>
@@ -408,7 +879,7 @@
               <w:pStyle w:val="MdTableCell"/>
             </w:pPr>
             <w:r>
-              <w:t xml:space="preserve">5% per paid booking + card fees; $5 per free booking; no monthly fee, cancel anytime</w:t>
+              <w:t xml:space="preserve">5% per booking + card fees</w:t>
             </w:r>
           </w:p>
         </w:tc>
@@ -457,20 +928,20 @@
               <w:pStyle w:val="MdTableCell"/>
             </w:pPr>
             <w:r>
-              <w:t xml:space="preserve">$29/month, 1 property, no commission (card fees passed through at cost)</w:t>
-            </w:r>
-          </w:p>
-        </w:tc>
-        <w:tc>
-          <w:tcPr>
-            <w:vAlign w:val="center"/>
-          </w:tcPr>
-          <w:p>
-            <w:pPr>
-              <w:pStyle w:val="MdTableCell"/>
-            </w:pPr>
-            <w:r>
-              <w:t xml:space="preserve">Active owners above ~$7K/yr in bookings</w:t>
+              <w:t xml:space="preserve">$29/month — no commission</w:t>
+            </w:r>
+          </w:p>
+        </w:tc>
+        <w:tc>
+          <w:tcPr>
+            <w:vAlign w:val="center"/>
+          </w:tcPr>
+          <w:p>
+            <w:pPr>
+              <w:pStyle w:val="MdTableCell"/>
+            </w:pPr>
+            <w:r>
+              <w:t xml:space="preserve">Active owners with 6+ bookings per year</w:t>
             </w:r>
           </w:p>
         </w:tc>
@@ -506,20 +977,96 @@
               <w:pStyle w:val="MdTableCell"/>
             </w:pPr>
             <w:r>
-              <w:t xml:space="preserve">$59/month, up to 5 properties, no commission</w:t>
-            </w:r>
-          </w:p>
-        </w:tc>
-        <w:tc>
-          <w:tcPr>
-            <w:vAlign w:val="center"/>
-          </w:tcPr>
-          <w:p>
-            <w:pPr>
-              <w:pStyle w:val="MdTableCell"/>
-            </w:pPr>
-            <w:r>
-              <w:t xml:space="preserve">Multi-unit owners above ~$14K/yr in bookings</w:t>
+              <w:t xml:space="preserve">$59/month — up to 5 properties, no commission</w:t>
+            </w:r>
+          </w:p>
+        </w:tc>
+        <w:tc>
+          <w:tcPr>
+            <w:vAlign w:val="center"/>
+          </w:tcPr>
+          <w:p>
+            <w:pPr>
+              <w:pStyle w:val="MdTableCell"/>
+            </w:pPr>
+            <w:r>
+              <w:t xml:space="preserve">Multi-property owners</w:t>
+            </w:r>
+          </w:p>
+        </w:tc>
+      </w:tr>
+    </w:tbl>
+    <w:p>
+      <w:pPr>
+        <w:pStyle w:val="Heading3"/>
+        <w:pStyle w:val="MdHeading3"/>
+      </w:pPr>
+      <w:r>
+        <w:t xml:space="preserve">Optional add-ons</w:t>
+      </w:r>
+    </w:p>
+    <w:tbl>
+      <w:tblPr>
+        <w:tblStyle w:val="MdTable"/>
+        <w:tblW w:type="pct" w:w="100%"/>
+        <w:tblBorders>
+          <w:top w:val="single" w:color="auto" w:sz="4"/>
+          <w:left w:val="single" w:color="auto" w:sz="4"/>
+          <w:bottom w:val="single" w:color="auto" w:sz="4"/>
+          <w:right w:val="single" w:color="auto" w:sz="4"/>
+          <w:insideH w:val="single" w:color="auto" w:sz="4"/>
+          <w:insideV w:val="single" w:color="auto" w:sz="4"/>
+        </w:tblBorders>
+      </w:tblPr>
+      <w:tblGrid>
+        <w:gridCol w:w="3333"/>
+        <w:gridCol w:w="3333"/>
+        <w:gridCol w:w="3333"/>
+      </w:tblGrid>
+      <w:tr>
+        <w:trPr>
+          <w:cantSplit/>
+          <w:tblHeader/>
+        </w:trPr>
+        <w:tc>
+          <w:tcPr>
+            <w:shd w:fill="F2F2F2"/>
+            <w:vAlign w:val="center"/>
+          </w:tcPr>
+          <w:p>
+            <w:pPr>
+              <w:pStyle w:val="MdTableHeader"/>
+            </w:pPr>
+            <w:r>
+              <w:t xml:space="preserve">Add-on</w:t>
+            </w:r>
+          </w:p>
+        </w:tc>
+        <w:tc>
+          <w:tcPr>
+            <w:shd w:fill="F2F2F2"/>
+            <w:vAlign w:val="center"/>
+          </w:tcPr>
+          <w:p>
+            <w:pPr>
+              <w:pStyle w:val="MdTableHeader"/>
+            </w:pPr>
+            <w:r>
+              <w:t xml:space="preserve">Price</w:t>
+            </w:r>
+          </w:p>
+        </w:tc>
+        <w:tc>
+          <w:tcPr>
+            <w:shd w:fill="F2F2F2"/>
+            <w:vAlign w:val="center"/>
+          </w:tcPr>
+          <w:p>
+            <w:pPr>
+              <w:pStyle w:val="MdTableHeader"/>
+            </w:pPr>
+            <w:r>
+              <w:t xml:space="preserve">What you get</w:t>
             </w:r>
           </w:p>
         </w:tc>
@@ -555,20 +1102,20 @@
               <w:pStyle w:val="MdTableCell"/>
             </w:pPr>
             <w:r>
-              <w:t xml:space="preserve">$5 per booking (our cost + 25%) — optional add-on</w:t>
-            </w:r>
-          </w:p>
-        </w:tc>
-        <w:tc>
-          <w:tcPr>
-            <w:vAlign w:val="center"/>
-          </w:tcPr>
-          <w:p>
-            <w:pPr>
-              <w:pStyle w:val="MdTableCell"/>
-            </w:pPr>
-            <w:r>
-              <w:t xml:space="preserve">ID + fraud check, recommended for public bookings</w:t>
+              <w:t xml:space="preserve">$5 per booking</w:t>
+            </w:r>
+          </w:p>
+        </w:tc>
+        <w:tc>
+          <w:tcPr>
+            <w:vAlign w:val="center"/>
+          </w:tcPr>
+          <w:p>
+            <w:pPr>
+              <w:pStyle w:val="MdTableCell"/>
+            </w:pPr>
+            <w:r>
+              <w:t xml:space="preserve">ID verification + fraud check</w:t>
             </w:r>
           </w:p>
         </w:tc>
@@ -604,25 +1151,41 @@
               <w:pStyle w:val="MdTableCell"/>
             </w:pPr>
             <w:r>
-              <w:t xml:space="preserve">$19.99 per booking (our cost + 25%) — optional add-on</w:t>
-            </w:r>
-          </w:p>
-        </w:tc>
-        <w:tc>
-          <w:tcPr>
-            <w:vAlign w:val="center"/>
-          </w:tcPr>
-          <w:p>
-            <w:pPr>
-              <w:pStyle w:val="MdTableCell"/>
-            </w:pPr>
-            <w:r>
-              <w:t xml:space="preserve">Screening plus damage protection up to $1M</w:t>
+              <w:t xml:space="preserve">$19.99 per booking</w:t>
+            </w:r>
+          </w:p>
+        </w:tc>
+        <w:tc>
+          <w:tcPr>
+            <w:vAlign w:val="center"/>
+          </w:tcPr>
+          <w:p>
+            <w:pPr>
+              <w:pStyle w:val="MdTableCell"/>
+            </w:pPr>
+            <w:r>
+              <w:t xml:space="preserve">Screening + up to $1M damage protection</w:t>
             </w:r>
           </w:p>
         </w:tc>
       </w:tr>
     </w:tbl>
+    <w:p>
+      <w:pPr>
+        <w:pStyle w:val="MdHtml"/>
+      </w:pPr>
+      <w:r>
+        <w:t xml:space="preserve">&lt;div class="callout"&gt;</w:t>
+      </w:r>
+      <w:r>
+        <w:br/>
+        <w:t xml:space="preserve">&lt;p&gt;&lt;strong&gt;Crossover point:&lt;/strong&gt; An owner booking more than ~$7,000/year through Familiar Guest saves money by switching from Pay-as-you-go (5%) to the $29/month Solo plan.&lt;/p&gt;</w:t>
+      </w:r>
+      <w:r>
+        <w:br/>
+        <w:t xml:space="preserve">&lt;/div&gt;</w:t>
+      </w:r>
+    </w:p>
     <w:p>
       <w:pPr>
         <w:pStyle w:val="MdHr"/>
@@ -642,30 +1205,324 @@
         <w:pStyle w:val="MdHeading2"/>
       </w:pPr>
       <w:r>
-        <w:t xml:space="preserve">Trust &amp; Safeguards</w:t>
-      </w:r>
-    </w:p>
+        <w:t xml:space="preserve">Competitive Position</w:t>
+      </w:r>
+    </w:p>
+    <w:tbl>
+      <w:tblPr>
+        <w:tblStyle w:val="MdTable"/>
+        <w:tblW w:type="pct" w:w="100%"/>
+        <w:tblBorders>
+          <w:top w:val="single" w:color="auto" w:sz="4"/>
+          <w:left w:val="single" w:color="auto" w:sz="4"/>
+          <w:bottom w:val="single" w:color="auto" w:sz="4"/>
+          <w:right w:val="single" w:color="auto" w:sz="4"/>
+          <w:insideH w:val="single" w:color="auto" w:sz="4"/>
+          <w:insideV w:val="single" w:color="auto" w:sz="4"/>
+        </w:tblBorders>
+      </w:tblPr>
+      <w:tblGrid>
+        <w:gridCol w:w="3333"/>
+        <w:gridCol w:w="3333"/>
+        <w:gridCol w:w="3333"/>
+      </w:tblGrid>
+      <w:tr>
+        <w:trPr>
+          <w:cantSplit/>
+          <w:tblHeader/>
+        </w:trPr>
+        <w:tc>
+          <w:tcPr>
+            <w:shd w:fill="F2F2F2"/>
+            <w:vAlign w:val="center"/>
+          </w:tcPr>
+          <w:p>
+            <w:pPr>
+              <w:pStyle w:val="MdTableHeader"/>
+            </w:pPr>
+            <w:r>
+              <w:t xml:space="preserve">Competitor</w:t>
+            </w:r>
+          </w:p>
+        </w:tc>
+        <w:tc>
+          <w:tcPr>
+            <w:shd w:fill="F2F2F2"/>
+            <w:vAlign w:val="center"/>
+          </w:tcPr>
+          <w:p>
+            <w:pPr>
+              <w:pStyle w:val="MdTableHeader"/>
+            </w:pPr>
+            <w:r>
+              <w:t xml:space="preserve">Their approach</w:t>
+            </w:r>
+          </w:p>
+        </w:tc>
+        <w:tc>
+          <w:tcPr>
+            <w:shd w:fill="F2F2F2"/>
+            <w:vAlign w:val="center"/>
+          </w:tcPr>
+          <w:p>
+            <w:pPr>
+              <w:pStyle w:val="MdTableHeader"/>
+            </w:pPr>
+            <w:r>
+              <w:t xml:space="preserve">Where we differ</w:t>
+            </w:r>
+          </w:p>
+        </w:tc>
+      </w:tr>
+      <w:tr>
+        <w:trPr>
+          <w:cantSplit/>
+        </w:trPr>
+        <w:tc>
+          <w:tcPr>
+            <w:vAlign w:val="center"/>
+          </w:tcPr>
+          <w:p>
+            <w:pPr>
+              <w:pStyle w:val="MdTableCell"/>
+            </w:pPr>
+            <w:r>
+              <w:rPr>
+                <w:rStyle w:val="MdStrong"/>
+                <w:b/>
+                <w:bCs/>
+              </w:rPr>
+              <w:t xml:space="preserve">Airbnb</w:t>
+            </w:r>
+          </w:p>
+        </w:tc>
+        <w:tc>
+          <w:tcPr>
+            <w:vAlign w:val="center"/>
+          </w:tcPr>
+          <w:p>
+            <w:pPr>
+              <w:pStyle w:val="MdTableCell"/>
+            </w:pPr>
+            <w:r>
+              <w:t xml:space="preserve">15.5% host fee, owns the guest relationship</w:t>
+            </w:r>
+          </w:p>
+        </w:tc>
+        <w:tc>
+          <w:tcPr>
+            <w:vAlign w:val="center"/>
+          </w:tcPr>
+          <w:p>
+            <w:pPr>
+              <w:pStyle w:val="MdTableCell"/>
+            </w:pPr>
+            <w:r>
+              <w:t xml:space="preserve">We charge 5% or flat monthly; the owner keeps the guest relationship</w:t>
+            </w:r>
+          </w:p>
+        </w:tc>
+      </w:tr>
+      <w:tr>
+        <w:trPr>
+          <w:cantSplit/>
+        </w:trPr>
+        <w:tc>
+          <w:tcPr>
+            <w:vAlign w:val="center"/>
+          </w:tcPr>
+          <w:p>
+            <w:pPr>
+              <w:pStyle w:val="MdTableCell"/>
+            </w:pPr>
+            <w:r>
+              <w:rPr>
+                <w:rStyle w:val="MdStrong"/>
+                <w:b/>
+                <w:bCs/>
+              </w:rPr>
+              <w:t xml:space="preserve">OwnerRez</w:t>
+            </w:r>
+          </w:p>
+        </w:tc>
+        <w:tc>
+          <w:tcPr>
+            <w:vAlign w:val="center"/>
+          </w:tcPr>
+          <w:p>
+            <w:pPr>
+              <w:pStyle w:val="MdTableCell"/>
+            </w:pPr>
+            <w:r>
+              <w:t xml:space="preserve">Powerful but complex; no native payments</w:t>
+            </w:r>
+          </w:p>
+        </w:tc>
+        <w:tc>
+          <w:tcPr>
+            <w:vAlign w:val="center"/>
+          </w:tcPr>
+          <w:p>
+            <w:pPr>
+              <w:pStyle w:val="MdTableCell"/>
+            </w:pPr>
+            <w:r>
+              <w:t xml:space="preserve">We're live in an afternoon with payments built in</w:t>
+            </w:r>
+          </w:p>
+        </w:tc>
+      </w:tr>
+      <w:tr>
+        <w:trPr>
+          <w:cantSplit/>
+        </w:trPr>
+        <w:tc>
+          <w:tcPr>
+            <w:vAlign w:val="center"/>
+          </w:tcPr>
+          <w:p>
+            <w:pPr>
+              <w:pStyle w:val="MdTableCell"/>
+            </w:pPr>
+            <w:r>
+              <w:rPr>
+                <w:rStyle w:val="MdStrong"/>
+                <w:b/>
+                <w:bCs/>
+              </w:rPr>
+              <w:t xml:space="preserve">Lodgify</w:t>
+            </w:r>
+          </w:p>
+        </w:tc>
+        <w:tc>
+          <w:tcPr>
+            <w:vAlign w:val="center"/>
+          </w:tcPr>
+          <w:p>
+            <w:pPr>
+              <w:pStyle w:val="MdTableCell"/>
+            </w:pPr>
+            <w:r>
+              <w:t xml:space="preserve">Website builder — owner drives their own traffic</w:t>
+            </w:r>
+          </w:p>
+        </w:tc>
+        <w:tc>
+          <w:tcPr>
+            <w:vAlign w:val="center"/>
+          </w:tcPr>
+          <w:p>
+            <w:pPr>
+              <w:pStyle w:val="MdTableCell"/>
+            </w:pPr>
+            <w:r>
+              <w:t xml:space="preserve">We focus on repeat guests, not SEO</w:t>
+            </w:r>
+          </w:p>
+        </w:tc>
+      </w:tr>
+      <w:tr>
+        <w:trPr>
+          <w:cantSplit/>
+        </w:trPr>
+        <w:tc>
+          <w:tcPr>
+            <w:vAlign w:val="center"/>
+          </w:tcPr>
+          <w:p>
+            <w:pPr>
+              <w:pStyle w:val="MdTableCell"/>
+            </w:pPr>
+            <w:r>
+              <w:rPr>
+                <w:rStyle w:val="MdStrong"/>
+                <w:b/>
+                <w:bCs/>
+              </w:rPr>
+              <w:t xml:space="preserve">Hospitable</w:t>
+            </w:r>
+          </w:p>
+        </w:tc>
+        <w:tc>
+          <w:tcPr>
+            <w:vAlign w:val="center"/>
+          </w:tcPr>
+          <w:p>
+            <w:pPr>
+              <w:pStyle w:val="MdTableCell"/>
+            </w:pPr>
+            <w:r>
+              <w:t xml:space="preserve">OTA automation; direct booking is a paid add-on</w:t>
+            </w:r>
+          </w:p>
+        </w:tc>
+        <w:tc>
+          <w:tcPr>
+            <w:vAlign w:val="center"/>
+          </w:tcPr>
+          <w:p>
+            <w:pPr>
+              <w:pStyle w:val="MdTableCell"/>
+            </w:pPr>
+            <w:r>
+              <w:t xml:space="preserve">Direct booking is our core product, not a bolt-on</w:t>
+            </w:r>
+          </w:p>
+        </w:tc>
+      </w:tr>
+      <w:tr>
+        <w:trPr>
+          <w:cantSplit/>
+        </w:trPr>
+        <w:tc>
+          <w:tcPr>
+            <w:vAlign w:val="center"/>
+          </w:tcPr>
+          <w:p>
+            <w:pPr>
+              <w:pStyle w:val="MdTableCell"/>
+            </w:pPr>
+            <w:r>
+              <w:rPr>
+                <w:rStyle w:val="MdStrong"/>
+                <w:b/>
+                <w:bCs/>
+              </w:rPr>
+              <w:t xml:space="preserve">Houfy</w:t>
+            </w:r>
+          </w:p>
+        </w:tc>
+        <w:tc>
+          <w:tcPr>
+            <w:vAlign w:val="center"/>
+          </w:tcPr>
+          <w:p>
+            <w:pPr>
+              <w:pStyle w:val="MdTableCell"/>
+            </w:pPr>
+            <w:r>
+              <w:t xml:space="preserve">Fee-free discovery marketplace</w:t>
+            </w:r>
+          </w:p>
+        </w:tc>
+        <w:tc>
+          <w:tcPr>
+            <w:vAlign w:val="center"/>
+          </w:tcPr>
+          <w:p>
+            <w:pPr>
+              <w:pStyle w:val="MdTableCell"/>
+            </w:pPr>
+            <w:r>
+              <w:t xml:space="preserve">We're a trust layer for known guests, not a marketplace</w:t>
+            </w:r>
+          </w:p>
+        </w:tc>
+      </w:tr>
+    </w:tbl>
     <w:p>
       <w:pPr>
         <w:pStyle w:val="MdParagraph"/>
-      </w:pPr>
-      <w:r>
-        <w:t xml:space="preserve">Because Familiar Guest processes the payment, we can offer protections a do-it-yourself website cannot:</w:t>
-      </w:r>
-    </w:p>
-    <w:p>
-      <w:pPr>
-        <w:pStyle w:val="MdSpace"/>
-      </w:pPr>
-    </w:p>
-    <w:p>
-      <w:pPr>
-        <w:pStyle w:val="ListParagraph"/>
-        <w:pStyle w:val="MdListItem"/>
-        <w:numPr>
-          <w:ilvl w:val="0"/>
-          <w:numId w:val="1"/>
-        </w:numPr>
       </w:pPr>
       <w:r>
         <w:rPr>
@@ -673,52 +1530,10 @@
           <w:b/>
           <w:bCs/>
         </w:rPr>
-        <w:t xml:space="preserve">Funds held until check-in (escrow)</w:t>
-      </w:r>
-      <w:r>
-        <w:t xml:space="preserve">, so a misrepresented or fake listing cannot simply take the money and disappear.</w:t>
-      </w:r>
-    </w:p>
-    <w:p>
-      <w:pPr>
-        <w:pStyle w:val="ListParagraph"/>
-        <w:pStyle w:val="MdListItem"/>
-        <w:numPr>
-          <w:ilvl w:val="0"/>
-          <w:numId w:val="1"/>
-        </w:numPr>
-      </w:pPr>
-      <w:r>
-        <w:rPr>
-          <w:rStyle w:val="MdStrong"/>
-          <w:b/>
-          <w:bCs/>
-        </w:rPr>
-        <w:t xml:space="preserve">Verified owners</w:t>
-      </w:r>
-      <w:r>
-        <w:t xml:space="preserve"> — every owner is identity-verified through Stripe as a condition of payout.</w:t>
-      </w:r>
-    </w:p>
-    <w:p>
-      <w:pPr>
-        <w:pStyle w:val="ListParagraph"/>
-        <w:pStyle w:val="MdListItem"/>
-        <w:numPr>
-          <w:ilvl w:val="0"/>
-          <w:numId w:val="1"/>
-        </w:numPr>
-      </w:pPr>
-      <w:r>
-        <w:rPr>
-          <w:rStyle w:val="MdStrong"/>
-          <w:b/>
-          <w:bCs/>
-        </w:rPr>
-        <w:t xml:space="preserve">Optional guest screening and damage protection</w:t>
-      </w:r>
-      <w:r>
-        <w:t xml:space="preserve"> for owners who open bookings to the public.</w:t>
+        <w:t xml:space="preserve">Our lane:</w:t>
+      </w:r>
+      <w:r>
+        <w:t xml:space="preserve"> effortless setup, repeat-guest focus, and trust built in by default. No incumbent owns all three.</w:t>
       </w:r>
     </w:p>
     <w:p>
@@ -728,16 +1543,12 @@
     </w:p>
     <w:p>
       <w:pPr>
-        <w:pStyle w:val="MdHr"/>
-        <w:pBdr>
-          <w:bottom w:val="single" w:color="auto" w:sz="6" w:space="1"/>
-        </w:pBdr>
-      </w:pPr>
-    </w:p>
-    <w:p>
-      <w:pPr>
-        <w:pStyle w:val="MdSpace"/>
-      </w:pPr>
+        <w:pStyle w:val="MdHtml"/>
+      </w:pPr>
+      <w:r>
+        <w:t xml:space="preserve">&lt;div class="page-break"&gt;&lt;/div&gt;
+</w:t>
+      </w:r>
     </w:p>
     <w:p>
       <w:pPr>
@@ -745,7 +1556,7 @@
         <w:pStyle w:val="MdHeading2"/>
       </w:pPr>
       <w:r>
-        <w:t xml:space="preserve">Financial Projections (Years 1-3)</w:t>
+        <w:t xml:space="preserve">Financial Projections</w:t>
       </w:r>
     </w:p>
     <w:p>
@@ -758,13 +1569,22 @@
           <w:i/>
           <w:iCs/>
         </w:rPr>
-        <w:t xml:space="preserve">Revised June 2026 to reflect solo-founder development model: platform built by the founder using AI-assisted development tools, deployed on Vercel, with a $5,000 budget for outside contract help on safety-critical components.</w:t>
+        <w:t xml:space="preserve">Solo-founder model: platform built by the founder using AI-assisted development tools, deployed on Vercel, with a $5,000 budget for outside contract review of safety-critical components.</w:t>
       </w:r>
     </w:p>
     <w:p>
       <w:pPr>
         <w:pStyle w:val="MdSpace"/>
       </w:pPr>
+    </w:p>
+    <w:p>
+      <w:pPr>
+        <w:pStyle w:val="Heading3"/>
+        <w:pStyle w:val="MdHeading3"/>
+      </w:pPr>
+      <w:r>
+        <w:t xml:space="preserve">Revenue &amp; Profitability</w:t>
+      </w:r>
     </w:p>
     <w:tbl>
       <w:tblPr>
@@ -917,63 +1737,6 @@
               <w:pStyle w:val="MdTableCell"/>
             </w:pPr>
             <w:r>
-              <w:t xml:space="preserve">Average active owners</w:t>
-            </w:r>
-          </w:p>
-        </w:tc>
-        <w:tc>
-          <w:tcPr>
-            <w:vAlign w:val="center"/>
-          </w:tcPr>
-          <w:p>
-            <w:pPr>
-              <w:pStyle w:val="MdTableCell"/>
-            </w:pPr>
-            <w:r>
-              <w:t xml:space="preserve">250</w:t>
-            </w:r>
-          </w:p>
-        </w:tc>
-        <w:tc>
-          <w:tcPr>
-            <w:vAlign w:val="center"/>
-          </w:tcPr>
-          <w:p>
-            <w:pPr>
-              <w:pStyle w:val="MdTableCell"/>
-            </w:pPr>
-            <w:r>
-              <w:t xml:space="preserve">2,000</w:t>
-            </w:r>
-          </w:p>
-        </w:tc>
-        <w:tc>
-          <w:tcPr>
-            <w:vAlign w:val="center"/>
-          </w:tcPr>
-          <w:p>
-            <w:pPr>
-              <w:pStyle w:val="MdTableCell"/>
-            </w:pPr>
-            <w:r>
-              <w:t xml:space="preserve">7,500</w:t>
-            </w:r>
-          </w:p>
-        </w:tc>
-      </w:tr>
-      <w:tr>
-        <w:trPr>
-          <w:cantSplit/>
-        </w:trPr>
-        <w:tc>
-          <w:tcPr>
-            <w:vAlign w:val="center"/>
-          </w:tcPr>
-          <w:p>
-            <w:pPr>
-              <w:pStyle w:val="MdTableCell"/>
-            </w:pPr>
-            <w:r>
               <w:rPr>
                 <w:rStyle w:val="MdStrong"/>
                 <w:b/>
@@ -1170,7 +1933,7 @@
                 <w:b/>
                 <w:bCs/>
               </w:rPr>
-              <w:t xml:space="preserve">Operating profit / (loss)</w:t>
+              <w:t xml:space="preserve">Operating profit</w:t>
             </w:r>
           </w:p>
         </w:tc>
@@ -1313,7 +2076,7 @@
         <w:pStyle w:val="MdHeading3"/>
       </w:pPr>
       <w:r>
-        <w:t xml:space="preserve">Operating expense detail</w:t>
+        <w:t xml:space="preserve">Where the money goes</w:t>
       </w:r>
     </w:p>
     <w:tbl>
@@ -1410,7 +2173,7 @@
               <w:pStyle w:val="MdTableCell"/>
             </w:pPr>
             <w:r>
-              <w:t xml:space="preserve">Infrastructure (Vercel, Supabase, domain)</w:t>
+              <w:t xml:space="preserve">Infrastructure (hosting, database, domain)</w:t>
             </w:r>
           </w:p>
         </w:tc>
@@ -1467,7 +2230,7 @@
               <w:pStyle w:val="MdTableCell"/>
             </w:pPr>
             <w:r>
-              <w:t xml:space="preserve">SaaS &amp; services (Resend, DocuSeal, monitoring)</w:t>
+              <w:t xml:space="preserve">SaaS services (email, e-signatures, monitoring)</w:t>
             </w:r>
           </w:p>
         </w:tc>
@@ -1524,7 +2287,7 @@
               <w:pStyle w:val="MdTableCell"/>
             </w:pPr>
             <w:r>
-              <w:t xml:space="preserve">AI &amp; dev tools (Claude, Cursor)</w:t>
+              <w:t xml:space="preserve">AI &amp; development tools</w:t>
             </w:r>
           </w:p>
         </w:tc>
@@ -1581,7 +2344,7 @@
               <w:pStyle w:val="MdTableCell"/>
             </w:pPr>
             <w:r>
-              <w:t xml:space="preserve">Outside help &amp; professional (contract dev, legal, insurance, accounting)</w:t>
+              <w:t xml:space="preserve">Professional services (contract dev, legal, insurance)</w:t>
             </w:r>
           </w:p>
         </w:tc>
@@ -1695,7 +2458,7 @@
               <w:pStyle w:val="MdTableCell"/>
             </w:pPr>
             <w:r>
-              <w:t xml:space="preserve">Customer support (tooling + part-time contractor in Y3)</w:t>
+              <w:t xml:space="preserve">Customer support</w:t>
             </w:r>
           </w:p>
         </w:tc>
@@ -1819,6 +2582,22 @@
     </w:tbl>
     <w:p>
       <w:pPr>
+        <w:pStyle w:val="MdHtml"/>
+      </w:pPr>
+      <w:r>
+        <w:t xml:space="preserve">&lt;div class="callout"&gt;</w:t>
+      </w:r>
+      <w:r>
+        <w:br/>
+        <w:t xml:space="preserve">&lt;p&gt;&lt;strong&gt;Profitable from Year 1.&lt;/strong&gt; No external funding required. Total operating expenses across three years sum to approximately $75,000. If capital is pursued, it would be for growth acceleration — not survival.&lt;/p&gt;</w:t>
+      </w:r>
+      <w:r>
+        <w:br/>
+        <w:t xml:space="preserve">&lt;/div&gt;</w:t>
+      </w:r>
+    </w:p>
+    <w:p>
+      <w:pPr>
         <w:pStyle w:val="Heading3"/>
         <w:pStyle w:val="MdHeading3"/>
       </w:pPr>
@@ -1836,7 +2615,7 @@
         </w:numPr>
       </w:pPr>
       <w:r>
-        <w:t xml:space="preserve">Blended revenue per active owner of approximately $350 per year, reflecting a mix weighted toward the no-commitment 5% plan and the $29 Solo plan.</w:t>
+        <w:t xml:space="preserve">Blended ARPU of ~$350/active owner/year (mix of 5% commission and $29 Solo plan, weighted toward casual owners)</w:t>
       </w:r>
     </w:p>
     <w:p>
@@ -1849,7 +2628,7 @@
         </w:numPr>
       </w:pPr>
       <w:r>
-        <w:t xml:space="preserve">Gross margin of approximately 78%, after Stripe Connect platform fees, hosting, and third-party APIs (calendar sync, screening administration). Card processing is passed through to owners at cost.</w:t>
+        <w:t xml:space="preserve">78% gross margin after Stripe platform fees, hosting, and third-party APIs</w:t>
       </w:r>
     </w:p>
     <w:p>
@@ -1862,7 +2641,7 @@
         </w:numPr>
       </w:pPr>
       <w:r>
-        <w:t xml:space="preserve">Growth driven primarily by low-friction onboarding and guest-and-owner referrals rather than paid acquisition; modest paid marketing is included in operating expenses.</w:t>
+        <w:t xml:space="preserve">Growth driven by low-friction onboarding and owner/guest referrals; modest paid marketing begins in Year 2</w:t>
       </w:r>
     </w:p>
     <w:p>
@@ -1875,7 +2654,52 @@
         </w:numPr>
       </w:pPr>
       <w:r>
-        <w:t xml:space="preserve">Revenue is calculated on the average number of active owners during each year to reflect the ramp in adoption.</w:t>
+        <w:t xml:space="preserve">First hire (part-time support) in Year 3 as owner base crosses ~5,000</w:t>
+      </w:r>
+    </w:p>
+    <w:p>
+      <w:pPr>
+        <w:pStyle w:val="MdSpace"/>
+      </w:pPr>
+    </w:p>
+    <w:p>
+      <w:pPr>
+        <w:pStyle w:val="MdParagraph"/>
+      </w:pPr>
+      <w:r>
+        <w:rPr>
+          <w:rStyle w:val="MdEm"/>
+          <w:i/>
+          <w:iCs/>
+        </w:rPr>
+        <w:t xml:space="preserve">These are illustrative projections, not guarantees. Results depend on owner acquisition and retention.</w:t>
+      </w:r>
+    </w:p>
+    <w:p>
+      <w:pPr>
+        <w:pStyle w:val="MdSpace"/>
+      </w:pPr>
+    </w:p>
+    <w:p>
+      <w:pPr>
+        <w:pStyle w:val="MdHr"/>
+        <w:pBdr>
+          <w:bottom w:val="single" w:color="auto" w:sz="6" w:space="1"/>
+        </w:pBdr>
+      </w:pPr>
+    </w:p>
+    <w:p>
+      <w:pPr>
+        <w:pStyle w:val="MdSpace"/>
+      </w:pPr>
+    </w:p>
+    <w:p>
+      <w:pPr>
+        <w:pStyle w:val="Heading2"/>
+        <w:pStyle w:val="MdHeading2"/>
+      </w:pPr>
+      <w:r>
+        <w:t xml:space="preserve">Risks — Honest Assessment</w:t>
       </w:r>
     </w:p>
     <w:p>
@@ -1893,10 +2717,10 @@
           <w:b/>
           <w:bCs/>
         </w:rPr>
-        <w:t xml:space="preserve">Development model:</w:t>
-      </w:r>
-      <w:r>
-        <w:t xml:space="preserve"> solo founder with professional developer and product management experience, building with AI-assisted tools (Claude Code, Cursor). $5,000 budgeted for contract review of safety-critical components (Stripe webhooks, escrow logic, security hardening). No full-time hires until unit economics justify it.</w:t>
+        <w:t xml:space="preserve">Adoption inertia.</w:t>
+      </w:r>
+      <w:r>
+        <w:t xml:space="preserve"> Repeat guests may rebook on Airbnb out of habit. Converting them requires the booking link to be easier than what they already do.</w:t>
       </w:r>
     </w:p>
     <w:p>
@@ -1914,125 +2738,10 @@
           <w:b/>
           <w:bCs/>
         </w:rPr>
-        <w:t xml:space="preserve">First headcount (Year 3):</w:t>
-      </w:r>
-      <w:r>
-        <w:t xml:space="preserve"> part-time customer support contractor (~10 hrs/wk) as owner base crosses ~5,000.</w:t>
-      </w:r>
-    </w:p>
-    <w:p>
-      <w:pPr>
-        <w:pStyle w:val="MdSpace"/>
-      </w:pPr>
-    </w:p>
-    <w:p>
-      <w:pPr>
-        <w:pStyle w:val="MdParagraph"/>
-      </w:pPr>
-      <w:r>
-        <w:rPr>
-          <w:rStyle w:val="MdEm"/>
-          <w:i/>
-          <w:iCs/>
-        </w:rPr>
-        <w:t xml:space="preserve">These figures are illustrative projections based on the assumptions above, not guarantees. Results depend heavily on owner acquisition and retention.</w:t>
-      </w:r>
-    </w:p>
-    <w:p>
-      <w:pPr>
-        <w:pStyle w:val="MdSpace"/>
-      </w:pPr>
-    </w:p>
-    <w:p>
-      <w:pPr>
-        <w:pStyle w:val="MdHr"/>
-        <w:pBdr>
-          <w:bottom w:val="single" w:color="auto" w:sz="6" w:space="1"/>
-        </w:pBdr>
-      </w:pPr>
-    </w:p>
-    <w:p>
-      <w:pPr>
-        <w:pStyle w:val="MdSpace"/>
-      </w:pPr>
-    </w:p>
-    <w:p>
-      <w:pPr>
-        <w:pStyle w:val="Heading2"/>
-        <w:pStyle w:val="MdHeading2"/>
-      </w:pPr>
-      <w:r>
-        <w:t xml:space="preserve">Funding Need</w:t>
-      </w:r>
-    </w:p>
-    <w:p>
-      <w:pPr>
-        <w:pStyle w:val="MdParagraph"/>
-      </w:pPr>
-      <w:r>
-        <w:t xml:space="preserve">Under the solo-founder model, the business is </w:t>
-      </w:r>
-      <w:r>
-        <w:rPr>
-          <w:rStyle w:val="MdStrong"/>
-          <w:b/>
-          <w:bCs/>
-        </w:rPr>
-        <w:t xml:space="preserve">profitable from Year 1</w:t>
-      </w:r>
-      <w:r>
-        <w:t xml:space="preserve"> with no external funding required. Total operating expenses across all three years sum to approximately $75,000 — well within reach of personal savings or a small friends-and-family round. The original projection of a $750K-$1M seed raise assumed hiring a development team; this is no longer necessary given AI-assisted development and the founder's technical background.</w:t>
-      </w:r>
-    </w:p>
-    <w:p>
-      <w:pPr>
-        <w:pStyle w:val="MdSpace"/>
-      </w:pPr>
-    </w:p>
-    <w:p>
-      <w:pPr>
-        <w:pStyle w:val="MdParagraph"/>
-      </w:pPr>
-      <w:r>
-        <w:t xml:space="preserve">If external capital is pursued, it would be for </w:t>
-      </w:r>
-      <w:r>
-        <w:rPr>
-          <w:rStyle w:val="MdStrong"/>
-          <w:b/>
-          <w:bCs/>
-        </w:rPr>
-        <w:t xml:space="preserve">growth acceleration</w:t>
-      </w:r>
-      <w:r>
-        <w:t xml:space="preserve"> (marketing, partnerships, or strategic hires), not survival.</w:t>
-      </w:r>
-    </w:p>
-    <w:p>
-      <w:pPr>
-        <w:pStyle w:val="MdSpace"/>
-      </w:pPr>
-    </w:p>
-    <w:p>
-      <w:pPr>
-        <w:pStyle w:val="MdHr"/>
-        <w:pBdr>
-          <w:bottom w:val="single" w:color="auto" w:sz="6" w:space="1"/>
-        </w:pBdr>
-      </w:pPr>
-    </w:p>
-    <w:p>
-      <w:pPr>
-        <w:pStyle w:val="MdSpace"/>
-      </w:pPr>
-    </w:p>
-    <w:p>
-      <w:pPr>
-        <w:pStyle w:val="Heading2"/>
-        <w:pStyle w:val="MdHeading2"/>
-      </w:pPr>
-      <w:r>
-        <w:t xml:space="preserve">Risks &amp; Honest Notes</w:t>
+        <w:t xml:space="preserve">Calendar dependency.</w:t>
+      </w:r>
+      <w:r>
+        <w:t xml:space="preserve"> Calendar sync relies on Airbnb's iCal feed, which Airbnb controls and could restrict. Listing content is owner-provided and has no platform dependency.</w:t>
       </w:r>
     </w:p>
     <w:p>
@@ -2050,19 +2759,45 @@
           <w:b/>
           <w:bCs/>
         </w:rPr>
-        <w:t xml:space="preserve">Adoption inertia:</w:t>
-      </w:r>
-      <w:r>
-        <w:t xml:space="preserve"> repeat guests may rebook on Airbnb out of habit. Converting them to direct booking is the central assumption of the model.</w:t>
-      </w:r>
-    </w:p>
-    <w:p>
-      <w:pPr>
-        <w:pStyle w:val="ListParagraph"/>
+        <w:t xml:space="preserve">Trust execution.</w:t>
+      </w:r>
+      <w:r>
+        <w:t xml:space="preserve"> The differentiation rests on escrow, verification, and screening working flawlessly. A single high-profile failure would undercut the core promise.</w:t>
+      </w:r>
+    </w:p>
+    <w:p>
+      <w:pPr>
+        <w:pStyle w:val="MdSpace"/>
+      </w:pPr>
+    </w:p>
+    <w:p>
+      <w:pPr>
+        <w:pStyle w:val="MdHr"/>
+        <w:pBdr>
+          <w:bottom w:val="single" w:color="auto" w:sz="6" w:space="1"/>
+        </w:pBdr>
+      </w:pPr>
+    </w:p>
+    <w:p>
+      <w:pPr>
+        <w:pStyle w:val="MdSpace"/>
+      </w:pPr>
+    </w:p>
+    <w:p>
+      <w:pPr>
+        <w:pStyle w:val="Heading2"/>
+        <w:pStyle w:val="MdHeading2"/>
+      </w:pPr>
+      <w:r>
+        <w:t xml:space="preserve">Next Steps</w:t>
+      </w:r>
+    </w:p>
+    <w:p>
+      <w:pPr>
         <w:pStyle w:val="MdListItem"/>
         <w:numPr>
           <w:ilvl w:val="0"/>
-          <w:numId w:val="1"/>
+          <w:numId w:val="2"/>
         </w:numPr>
       </w:pPr>
       <w:r>
@@ -2071,19 +2806,18 @@
           <w:b/>
           <w:bCs/>
         </w:rPr>
-        <w:t xml:space="preserve">Calendar dependence:</w:t>
-      </w:r>
-      <w:r>
-        <w:t xml:space="preserve"> instant setup relies on Airbnb's iCal feed, which Airbnb controls and could restrict.</w:t>
-      </w:r>
-    </w:p>
-    <w:p>
-      <w:pPr>
-        <w:pStyle w:val="ListParagraph"/>
+        <w:t xml:space="preserve">Validate with 30–50 target owners</w:t>
+      </w:r>
+      <w:r>
+        <w:t xml:space="preserve"> — confirm the share of bookings that are repeat guests and willingness to take them direct.</w:t>
+      </w:r>
+    </w:p>
+    <w:p>
+      <w:pPr>
         <w:pStyle w:val="MdListItem"/>
         <w:numPr>
           <w:ilvl w:val="0"/>
-          <w:numId w:val="1"/>
+          <w:numId w:val="2"/>
         </w:numPr>
       </w:pPr>
       <w:r>
@@ -2092,37 +2826,10 @@
           <w:b/>
           <w:bCs/>
         </w:rPr>
-        <w:t xml:space="preserve">Public-booking trust:</w:t>
-      </w:r>
-      <w:r>
-        <w:t xml:space="preserve"> scaling beyond trusted guests requires the escrow, verification, and screening stack to be airtight first.</w:t>
-      </w:r>
-    </w:p>
-    <w:p>
-      <w:pPr>
-        <w:pStyle w:val="MdSpace"/>
-      </w:pPr>
-    </w:p>
-    <w:p>
-      <w:pPr>
-        <w:pStyle w:val="MdHr"/>
-        <w:pBdr>
-          <w:bottom w:val="single" w:color="auto" w:sz="6" w:space="1"/>
-        </w:pBdr>
-      </w:pPr>
-    </w:p>
-    <w:p>
-      <w:pPr>
-        <w:pStyle w:val="MdSpace"/>
-      </w:pPr>
-    </w:p>
-    <w:p>
-      <w:pPr>
-        <w:pStyle w:val="Heading2"/>
-        <w:pStyle w:val="MdHeading2"/>
-      </w:pPr>
-      <w:r>
-        <w:t xml:space="preserve">Recommended Next Steps</w:t>
+        <w:t xml:space="preserve">Build the core</w:t>
+      </w:r>
+      <w:r>
+        <w:t xml:space="preserve"> — owner-driven listing creation, iCal calendar sync, Stripe-verified onboarding, branded booking link, and payments with escrow.</w:t>
       </w:r>
     </w:p>
     <w:p>
@@ -2130,7 +2837,7 @@
         <w:pStyle w:val="MdListItem"/>
         <w:numPr>
           <w:ilvl w:val="0"/>
-          <w:numId w:val="3"/>
+          <w:numId w:val="2"/>
         </w:numPr>
       </w:pPr>
       <w:r>
@@ -2139,50 +2846,44 @@
           <w:b/>
           <w:bCs/>
         </w:rPr>
-        <w:t xml:space="preserve">Validate with 30-50 target owners:</w:t>
-      </w:r>
-      <w:r>
-        <w:t xml:space="preserve"> confirm the share of bookings that are repeat guests and their willingness to take them direct.</w:t>
-      </w:r>
-    </w:p>
-    <w:p>
-      <w:pPr>
-        <w:pStyle w:val="MdListItem"/>
-        <w:numPr>
-          <w:ilvl w:val="0"/>
-          <w:numId w:val="3"/>
-        </w:numPr>
-      </w:pPr>
-      <w:r>
-        <w:rPr>
-          <w:rStyle w:val="MdStrong"/>
-          <w:b/>
-          <w:bCs/>
-        </w:rPr>
-        <w:t xml:space="preserve">Build the core:</w:t>
-      </w:r>
-      <w:r>
-        <w:t xml:space="preserve"> owner-driven listing creation (photo upload, AI description), iCal calendar sync, Stripe-verified onboarding, a branded booking link, and payments with escrow.</w:t>
-      </w:r>
-    </w:p>
-    <w:p>
-      <w:pPr>
-        <w:pStyle w:val="MdListItem"/>
-        <w:numPr>
-          <w:ilvl w:val="0"/>
-          <w:numId w:val="3"/>
-        </w:numPr>
-      </w:pPr>
-      <w:r>
-        <w:rPr>
-          <w:rStyle w:val="MdStrong"/>
-          <w:b/>
-          <w:bCs/>
-        </w:rPr>
-        <w:t xml:space="preserve">Launch trusted-guest mode</w:t>
-      </w:r>
-      <w:r>
-        <w:t xml:space="preserve"> in one beachhead niche; add public bookings and screening once core retention is proven.</w:t>
+        <w:t xml:space="preserve">Launch in trusted-guest mode</w:t>
+      </w:r>
+      <w:r>
+        <w:t xml:space="preserve"> in one beachhead niche; add public bookings and screening once retention is proven.</w:t>
+      </w:r>
+    </w:p>
+    <w:p>
+      <w:pPr>
+        <w:pStyle w:val="MdSpace"/>
+      </w:pPr>
+    </w:p>
+    <w:p>
+      <w:pPr>
+        <w:pStyle w:val="MdHr"/>
+        <w:pBdr>
+          <w:bottom w:val="single" w:color="auto" w:sz="6" w:space="1"/>
+        </w:pBdr>
+      </w:pPr>
+    </w:p>
+    <w:p>
+      <w:pPr>
+        <w:pStyle w:val="MdSpace"/>
+      </w:pPr>
+    </w:p>
+    <w:p>
+      <w:pPr>
+        <w:pStyle w:val="MdHtml"/>
+      </w:pPr>
+      <w:r>
+        <w:t xml:space="preserve">&lt;div style="text-align: center; margin-top: 30px; color: #8a7e72; font-size: 11px;"&gt;</w:t>
+      </w:r>
+      <w:r>
+        <w:br/>
+        <w:t xml:space="preserve">familiarguest.com &amp;nbsp;&amp;nbsp;|&amp;nbsp;&amp;nbsp; June 2026</w:t>
+      </w:r>
+      <w:r>
+        <w:br/>
+        <w:t xml:space="preserve">&lt;/div&gt;</w:t>
       </w:r>
     </w:p>
     <w:sectPr>
@@ -2473,12 +3174,6 @@
       <w:startOverride w:val="1"/>
     </w:lvlOverride>
   </w:num>
-  <w:num w:numId="3">
-    <w:abstractNumId w:val="2"/>
-    <w:lvlOverride w:ilvl="0">
-      <w:startOverride w:val="1"/>
-    </w:lvlOverride>
-  </w:num>
 </w:numbering>
 </file>
 

</xml_diff>

<commit_message>
Rename website domain to famguest.com (company name unchanged)
The website is now famguest.com; the company remains "Familiar Guest".
Updated the domain across CLAUDE.md and all docs (business, planning,
marketing, mockup) and regenerated every PDF and Word file.

Co-Authored-By: Claude Opus 4.6 <noreply@anthropic.com>
</commit_message>
<xml_diff>
--- a/docs/business/Familiar_Guest_Business_Brief.docx
+++ b/docs/business/Familiar_Guest_Business_Brief.docx
@@ -91,7 +91,7 @@
       <w:r>
         <w:t xml:space="preserve">stylesheet: </w:t>
       </w:r>
-      <w:hyperlink w:history="1" r:id="rIduwumznkkobbdkevdrqmzk">
+      <w:hyperlink w:history="1" r:id="rIdwa_ktvcabahxfeo-yw-zr">
         <w:r>
           <w:rPr>
             <w:rStyle w:val="MdLink"/>
@@ -2879,7 +2879,7 @@
       </w:r>
       <w:r>
         <w:br/>
-        <w:t xml:space="preserve">familiarguest.com &amp;nbsp;&amp;nbsp;|&amp;nbsp;&amp;nbsp; June 2026</w:t>
+        <w:t xml:space="preserve">famguest.com &amp;nbsp;&amp;nbsp;|&amp;nbsp;&amp;nbsp; June 2026</w:t>
       </w:r>
       <w:r>
         <w:br/>

</xml_diff>

<commit_message>
Update plan tiers: Solo up to 5 properties, Pro 6-10, cap at 10
- Solo now covers up to 5 properties; Pro is 6-10 properties
- No tiers above 10 properties (focus stays on individual renters)
- Caretaker seats set to 5 on all plans and de-emphasized: removed
  from pricing comparisons and marketing copy, kept as a baseline note
  in context only
- Regenerated affected PDFs and Word docs

Co-Authored-By: Claude Opus 4.6 <noreply@anthropic.com>
</commit_message>
<xml_diff>
--- a/docs/business/Familiar_Guest_Business_Brief.docx
+++ b/docs/business/Familiar_Guest_Business_Brief.docx
@@ -91,7 +91,7 @@
       <w:r>
         <w:t xml:space="preserve">stylesheet: </w:t>
       </w:r>
-      <w:hyperlink w:history="1" r:id="rIdwa_ktvcabahxfeo-yw-zr">
+      <w:hyperlink w:history="1" r:id="rIdtjhmbs3pilsblx9rvok9f">
         <w:r>
           <w:rPr>
             <w:rStyle w:val="MdLink"/>
@@ -928,7 +928,7 @@
               <w:pStyle w:val="MdTableCell"/>
             </w:pPr>
             <w:r>
-              <w:t xml:space="preserve">$29/month — no commission</w:t>
+              <w:t xml:space="preserve">$29/month — up to 5 properties, no commission</w:t>
             </w:r>
           </w:p>
         </w:tc>
@@ -977,20 +977,20 @@
               <w:pStyle w:val="MdTableCell"/>
             </w:pPr>
             <w:r>
-              <w:t xml:space="preserve">$59/month — up to 5 properties, no commission</w:t>
-            </w:r>
-          </w:p>
-        </w:tc>
-        <w:tc>
-          <w:tcPr>
-            <w:vAlign w:val="center"/>
-          </w:tcPr>
-          <w:p>
-            <w:pPr>
-              <w:pStyle w:val="MdTableCell"/>
-            </w:pPr>
-            <w:r>
-              <w:t xml:space="preserve">Multi-property owners</w:t>
+              <w:t xml:space="preserve">$59/month — 6–10 properties, no commission</w:t>
+            </w:r>
+          </w:p>
+        </w:tc>
+        <w:tc>
+          <w:tcPr>
+            <w:vAlign w:val="center"/>
+          </w:tcPr>
+          <w:p>
+            <w:pPr>
+              <w:pStyle w:val="MdTableCell"/>
+            </w:pPr>
+            <w:r>
+              <w:t xml:space="preserve">Owners with several homes</w:t>
             </w:r>
           </w:p>
         </w:tc>

</xml_diff>

<commit_message>
Add Starter plan, rename Solo to Host, drop Pro to $49
- New Starter plan: $12/mo, 1 property, no commission
- Solo renamed to Host ($29/mo, up to 5 properties)
- Pro repriced from $59 to $49/mo (6-10 properties)
- State on every pricing surface that all plans are subject to
  payment processing fees (passed through at cost)
- Update crossover logic (~$2,880/yr now favors Starter) and annual
  pricing; note ARPU should be revisited
- Regenerated all affected PDFs and Word docs

Co-Authored-By: Claude Opus 4.6 <noreply@anthropic.com>
</commit_message>
<xml_diff>
--- a/docs/business/Familiar_Guest_Business_Brief.docx
+++ b/docs/business/Familiar_Guest_Business_Brief.docx
@@ -91,7 +91,7 @@
       <w:r>
         <w:t xml:space="preserve">stylesheet: </w:t>
       </w:r>
-      <w:hyperlink w:history="1" r:id="rIdtjhmbs3pilsblx9rvok9f">
+      <w:hyperlink w:history="1" r:id="rIduwcv7-m-vucnd-le_p-nj">
         <w:r>
           <w:rPr>
             <w:rStyle w:val="MdLink"/>
@@ -879,7 +879,7 @@
               <w:pStyle w:val="MdTableCell"/>
             </w:pPr>
             <w:r>
-              <w:t xml:space="preserve">5% per booking + card fees</w:t>
+              <w:t xml:space="preserve">5% per booking + payment fees</w:t>
             </w:r>
           </w:p>
         </w:tc>
@@ -915,7 +915,56 @@
                 <w:b/>
                 <w:bCs/>
               </w:rPr>
-              <w:t xml:space="preserve">Solo</w:t>
+              <w:t xml:space="preserve">Starter</w:t>
+            </w:r>
+          </w:p>
+        </w:tc>
+        <w:tc>
+          <w:tcPr>
+            <w:vAlign w:val="center"/>
+          </w:tcPr>
+          <w:p>
+            <w:pPr>
+              <w:pStyle w:val="MdTableCell"/>
+            </w:pPr>
+            <w:r>
+              <w:t xml:space="preserve">$12/month — 1 property, no commission</w:t>
+            </w:r>
+          </w:p>
+        </w:tc>
+        <w:tc>
+          <w:tcPr>
+            <w:vAlign w:val="center"/>
+          </w:tcPr>
+          <w:p>
+            <w:pPr>
+              <w:pStyle w:val="MdTableCell"/>
+            </w:pPr>
+            <w:r>
+              <w:t xml:space="preserve">Single-home owners</w:t>
+            </w:r>
+          </w:p>
+        </w:tc>
+      </w:tr>
+      <w:tr>
+        <w:trPr>
+          <w:cantSplit/>
+        </w:trPr>
+        <w:tc>
+          <w:tcPr>
+            <w:vAlign w:val="center"/>
+          </w:tcPr>
+          <w:p>
+            <w:pPr>
+              <w:pStyle w:val="MdTableCell"/>
+            </w:pPr>
+            <w:r>
+              <w:rPr>
+                <w:rStyle w:val="MdStrong"/>
+                <w:b/>
+                <w:bCs/>
+              </w:rPr>
+              <w:t xml:space="preserve">Host</w:t>
             </w:r>
           </w:p>
         </w:tc>
@@ -941,7 +990,7 @@
               <w:pStyle w:val="MdTableCell"/>
             </w:pPr>
             <w:r>
-              <w:t xml:space="preserve">Active owners with 6+ bookings per year</w:t>
+              <w:t xml:space="preserve">Active owners with multiple homes</w:t>
             </w:r>
           </w:p>
         </w:tc>
@@ -977,7 +1026,7 @@
               <w:pStyle w:val="MdTableCell"/>
             </w:pPr>
             <w:r>
-              <w:t xml:space="preserve">$59/month — 6–10 properties, no commission</w:t>
+              <w:t xml:space="preserve">$49/month — 6–10 properties, no commission</w:t>
             </w:r>
           </w:p>
         </w:tc>
@@ -996,6 +1045,24 @@
         </w:tc>
       </w:tr>
     </w:tbl>
+    <w:p>
+      <w:pPr>
+        <w:pStyle w:val="MdParagraph"/>
+      </w:pPr>
+      <w:r>
+        <w:rPr>
+          <w:rStyle w:val="MdEm"/>
+          <w:i/>
+          <w:iCs/>
+        </w:rPr>
+        <w:t xml:space="preserve">All plans are subject to payment processing fees (card + currency conversion), passed through at cost.</w:t>
+      </w:r>
+    </w:p>
+    <w:p>
+      <w:pPr>
+        <w:pStyle w:val="MdSpace"/>
+      </w:pPr>
+    </w:p>
     <w:p>
       <w:pPr>
         <w:pStyle w:val="Heading3"/>
@@ -1179,7 +1246,7 @@
       </w:r>
       <w:r>
         <w:br/>
-        <w:t xml:space="preserve">&lt;p&gt;&lt;strong&gt;Crossover point:&lt;/strong&gt; An owner booking more than ~$7,000/year through Familiar Guest saves money by switching from Pay-as-you-go (5%) to the $29/month Solo plan.&lt;/p&gt;</w:t>
+        <w:t xml:space="preserve">&lt;p&gt;&lt;strong&gt;Crossover point:&lt;/strong&gt; An owner booking more than ~$2,880/year through Familiar Guest saves money by switching from Pay-as-you-go (5%) to the $12/month Starter plan, then to Host when they add a second property.&lt;/p&gt;</w:t>
       </w:r>
       <w:r>
         <w:br/>
@@ -2615,7 +2682,7 @@
         </w:numPr>
       </w:pPr>
       <w:r>
-        <w:t xml:space="preserve">Blended ARPU of ~$350/active owner/year (mix of 5% commission and $29 Solo plan, weighted toward casual owners)</w:t>
+        <w:t xml:space="preserve">Blended ARPU of ~$350/active owner/year (mix of 5% commission and the $12 Starter / $29 Host / $49 Pro plans, weighted toward casual owners). Revisit as the plan mix is validated with real owners.</w:t>
       </w:r>
     </w:p>
     <w:p>

</xml_diff>

<commit_message>
Set Starter to $15, add owner brochure with first-month-free offer
- Starter raised $12 -> $15 across all docs; blended ARPU re-modeled
  ~$200 -> ~$218; financial model v2 (md + xlsx) recomputed
- $15 Starter improves the stress case (Year 3 now thinly profitable)
- New 4-page owner marketing brochure (docs/marketing/owner-brochure-mexico)
  with the launch first-month-free offer (subscription only; add-ons,
  screening, and card fees still apply)
- First-month-free offer documented in CLAUDE.md pricing; PAYG note
  added re: short 1-2 night stays with add-ons vs Airbnb
- Regenerated all affected PDFs, Word docs, and the spreadsheet

Co-Authored-By: Claude Opus 4.6 <noreply@anthropic.com>
</commit_message>
<xml_diff>
--- a/docs/business/Familiar_Guest_Business_Brief.docx
+++ b/docs/business/Familiar_Guest_Business_Brief.docx
@@ -91,7 +91,7 @@
       <w:r>
         <w:t xml:space="preserve">stylesheet: </w:t>
       </w:r>
-      <w:hyperlink w:history="1" r:id="rIduwcv7-m-vucnd-le_p-nj">
+      <w:hyperlink w:history="1" r:id="rIdgwz2tca8tt7dvmynhiq5i">
         <w:r>
           <w:rPr>
             <w:rStyle w:val="MdLink"/>
@@ -928,7 +928,7 @@
               <w:pStyle w:val="MdTableCell"/>
             </w:pPr>
             <w:r>
-              <w:t xml:space="preserve">$12/month — 1 property, no commission</w:t>
+              <w:t xml:space="preserve">$15/month — 1 property, no commission</w:t>
             </w:r>
           </w:p>
         </w:tc>
@@ -1246,7 +1246,7 @@
       </w:r>
       <w:r>
         <w:br/>
-        <w:t xml:space="preserve">&lt;p&gt;&lt;strong&gt;Crossover point:&lt;/strong&gt; An owner booking more than ~$2,880/year through Familiar Guest saves money by switching from Pay-as-you-go (5%) to the $12/month Starter plan, then to Host when they add a second property.&lt;/p&gt;</w:t>
+        <w:t xml:space="preserve">&lt;p&gt;&lt;strong&gt;Crossover point:&lt;/strong&gt; An owner booking more than ~$3,600/year through Familiar Guest saves money by switching from Pay-as-you-go (5%) to the $15/month Starter plan, then to Host when they add a second property.&lt;/p&gt;</w:t>
       </w:r>
       <w:r>
         <w:br/>
@@ -2682,7 +2682,7 @@
         </w:numPr>
       </w:pPr>
       <w:r>
-        <w:t xml:space="preserve">Blended ARPU of ~$350/active owner/year (mix of 5% commission and the $12 Starter / $29 Host / $49 Pro plans, weighted toward casual owners). Revisit as the plan mix is validated with real owners.</w:t>
+        <w:t xml:space="preserve">Blended ARPU of ~$218/active owner/year (mix of 5% commission and the $15 Starter / $29 Host / $49 Pro plans, weighted toward casual owners). See the v2 financial model for the full re-projection. Revisit as the plan mix is validated with real owners.</w:t>
       </w:r>
     </w:p>
     <w:p>

</xml_diff>

<commit_message>
Factor Mexican taxes & cross-border fees into business brief
- Reconciled financials to the v2 model (ARPU ~$218, 76% gross margin,
  realistic OpEx) — fixes stale $350-ARPU / $11k-OpEx numbers
- Added a "Taxes, fees & cross-border costs" treatment: owner ISR/IVA/
  ISH and US occupancy taxes are pass-through (not revenue); IVA on our
  service fee net-zero with absorb-downside noted; payments/FX at cost
- Added explicit cross-border tax & compliance OpEx line; realistic
  support/marketing costs -> Year 1 ~breakeven, Years 2-3 profitable
- Added cross-border tax exposure and support-cost risks
- Regenerated PDF + docx

Co-Authored-By: Claude Opus 4.6 <noreply@anthropic.com>
</commit_message>
<xml_diff>
--- a/docs/business/Familiar_Guest_Business_Brief.docx
+++ b/docs/business/Familiar_Guest_Business_Brief.docx
@@ -91,7 +91,7 @@
       <w:r>
         <w:t xml:space="preserve">stylesheet: </w:t>
       </w:r>
-      <w:hyperlink w:history="1" r:id="rIdgwz2tca8tt7dvmynhiq5i">
+      <w:hyperlink w:history="1" r:id="rId0ihziju4sncepldrsblo7">
         <w:r>
           <w:rPr>
             <w:rStyle w:val="MdLink"/>
@@ -1636,7 +1636,7 @@
           <w:i/>
           <w:iCs/>
         </w:rPr>
-        <w:t xml:space="preserve">Solo-founder model: platform built by the founder using AI-assisted development tools, deployed on Vercel, with a $5,000 budget for outside contract review of safety-critical components.</w:t>
+        <w:t xml:space="preserve">Re-modeled on the Starter/Host/Pro pricing (blended ARPU ~$218) with realistic operating costs and Mexican taxes &amp;amp; cross-border fees factored in. Full detail in the v2 financial model.</w:t>
       </w:r>
     </w:p>
     <w:p>
@@ -1747,6 +1747,63 @@
               <w:pStyle w:val="MdTableCell"/>
             </w:pPr>
             <w:r>
+              <w:t xml:space="preserve">Avg active owners</w:t>
+            </w:r>
+          </w:p>
+        </w:tc>
+        <w:tc>
+          <w:tcPr>
+            <w:vAlign w:val="center"/>
+          </w:tcPr>
+          <w:p>
+            <w:pPr>
+              <w:pStyle w:val="MdTableCell"/>
+            </w:pPr>
+            <w:r>
+              <w:t xml:space="preserve">250</w:t>
+            </w:r>
+          </w:p>
+        </w:tc>
+        <w:tc>
+          <w:tcPr>
+            <w:vAlign w:val="center"/>
+          </w:tcPr>
+          <w:p>
+            <w:pPr>
+              <w:pStyle w:val="MdTableCell"/>
+            </w:pPr>
+            <w:r>
+              <w:t xml:space="preserve">2,000</w:t>
+            </w:r>
+          </w:p>
+        </w:tc>
+        <w:tc>
+          <w:tcPr>
+            <w:vAlign w:val="center"/>
+          </w:tcPr>
+          <w:p>
+            <w:pPr>
+              <w:pStyle w:val="MdTableCell"/>
+            </w:pPr>
+            <w:r>
+              <w:t xml:space="preserve">7,500</w:t>
+            </w:r>
+          </w:p>
+        </w:tc>
+      </w:tr>
+      <w:tr>
+        <w:trPr>
+          <w:cantSplit/>
+        </w:trPr>
+        <w:tc>
+          <w:tcPr>
+            <w:vAlign w:val="center"/>
+          </w:tcPr>
+          <w:p>
+            <w:pPr>
+              <w:pStyle w:val="MdTableCell"/>
+            </w:pPr>
+            <w:r>
               <w:t xml:space="preserve">Active owners (year-end)</w:t>
             </w:r>
           </w:p>
@@ -1787,6 +1844,63 @@
             </w:pPr>
             <w:r>
               <w:t xml:space="preserve">12,000</w:t>
+            </w:r>
+          </w:p>
+        </w:tc>
+      </w:tr>
+      <w:tr>
+        <w:trPr>
+          <w:cantSplit/>
+        </w:trPr>
+        <w:tc>
+          <w:tcPr>
+            <w:vAlign w:val="center"/>
+          </w:tcPr>
+          <w:p>
+            <w:pPr>
+              <w:pStyle w:val="MdTableCell"/>
+            </w:pPr>
+            <w:r>
+              <w:t xml:space="preserve">Blended ARPU</w:t>
+            </w:r>
+          </w:p>
+        </w:tc>
+        <w:tc>
+          <w:tcPr>
+            <w:vAlign w:val="center"/>
+          </w:tcPr>
+          <w:p>
+            <w:pPr>
+              <w:pStyle w:val="MdTableCell"/>
+            </w:pPr>
+            <w:r>
+              <w:t xml:space="preserve">$218</w:t>
+            </w:r>
+          </w:p>
+        </w:tc>
+        <w:tc>
+          <w:tcPr>
+            <w:vAlign w:val="center"/>
+          </w:tcPr>
+          <w:p>
+            <w:pPr>
+              <w:pStyle w:val="MdTableCell"/>
+            </w:pPr>
+            <w:r>
+              <w:t xml:space="preserve">$218</w:t>
+            </w:r>
+          </w:p>
+        </w:tc>
+        <w:tc>
+          <w:tcPr>
+            <w:vAlign w:val="center"/>
+          </w:tcPr>
+          <w:p>
+            <w:pPr>
+              <w:pStyle w:val="MdTableCell"/>
+            </w:pPr>
+            <w:r>
+              <w:t xml:space="preserve">$218</w:t>
             </w:r>
           </w:p>
         </w:tc>
@@ -1827,7 +1941,7 @@
                 <w:b/>
                 <w:bCs/>
               </w:rPr>
-              <w:t xml:space="preserve">$87,500</w:t>
+              <w:t xml:space="preserve">$54,500</w:t>
             </w:r>
           </w:p>
         </w:tc>
@@ -1845,7 +1959,7 @@
                 <w:b/>
                 <w:bCs/>
               </w:rPr>
-              <w:t xml:space="preserve">$700,000</w:t>
+              <w:t xml:space="preserve">$436,000</w:t>
             </w:r>
           </w:p>
         </w:tc>
@@ -1863,7 +1977,7 @@
                 <w:b/>
                 <w:bCs/>
               </w:rPr>
-              <w:t xml:space="preserve">$2,625,000</w:t>
+              <w:t xml:space="preserve">$1,635,000</w:t>
             </w:r>
           </w:p>
         </w:tc>
@@ -1881,46 +1995,46 @@
               <w:pStyle w:val="MdTableCell"/>
             </w:pPr>
             <w:r>
-              <w:t xml:space="preserve">Gross profit (78% margin)</w:t>
-            </w:r>
-          </w:p>
-        </w:tc>
-        <w:tc>
-          <w:tcPr>
-            <w:vAlign w:val="center"/>
-          </w:tcPr>
-          <w:p>
-            <w:pPr>
-              <w:pStyle w:val="MdTableCell"/>
-            </w:pPr>
-            <w:r>
-              <w:t xml:space="preserve">$68,250</w:t>
-            </w:r>
-          </w:p>
-        </w:tc>
-        <w:tc>
-          <w:tcPr>
-            <w:vAlign w:val="center"/>
-          </w:tcPr>
-          <w:p>
-            <w:pPr>
-              <w:pStyle w:val="MdTableCell"/>
-            </w:pPr>
-            <w:r>
-              <w:t xml:space="preserve">$546,000</w:t>
-            </w:r>
-          </w:p>
-        </w:tc>
-        <w:tc>
-          <w:tcPr>
-            <w:vAlign w:val="center"/>
-          </w:tcPr>
-          <w:p>
-            <w:pPr>
-              <w:pStyle w:val="MdTableCell"/>
-            </w:pPr>
-            <w:r>
-              <w:t xml:space="preserve">$2,047,500</w:t>
+              <w:t xml:space="preserve">Gross profit (76% margin)</w:t>
+            </w:r>
+          </w:p>
+        </w:tc>
+        <w:tc>
+          <w:tcPr>
+            <w:vAlign w:val="center"/>
+          </w:tcPr>
+          <w:p>
+            <w:pPr>
+              <w:pStyle w:val="MdTableCell"/>
+            </w:pPr>
+            <w:r>
+              <w:t xml:space="preserve">$41,420</w:t>
+            </w:r>
+          </w:p>
+        </w:tc>
+        <w:tc>
+          <w:tcPr>
+            <w:vAlign w:val="center"/>
+          </w:tcPr>
+          <w:p>
+            <w:pPr>
+              <w:pStyle w:val="MdTableCell"/>
+            </w:pPr>
+            <w:r>
+              <w:t xml:space="preserve">$331,360</w:t>
+            </w:r>
+          </w:p>
+        </w:tc>
+        <w:tc>
+          <w:tcPr>
+            <w:vAlign w:val="center"/>
+          </w:tcPr>
+          <w:p>
+            <w:pPr>
+              <w:pStyle w:val="MdTableCell"/>
+            </w:pPr>
+            <w:r>
+              <w:t xml:space="preserve">$1,242,600</w:t>
             </w:r>
           </w:p>
         </w:tc>
@@ -1938,46 +2052,46 @@
               <w:pStyle w:val="MdTableCell"/>
             </w:pPr>
             <w:r>
-              <w:t xml:space="preserve">Operating expenses</w:t>
-            </w:r>
-          </w:p>
-        </w:tc>
-        <w:tc>
-          <w:tcPr>
-            <w:vAlign w:val="center"/>
-          </w:tcPr>
-          <w:p>
-            <w:pPr>
-              <w:pStyle w:val="MdTableCell"/>
-            </w:pPr>
-            <w:r>
-              <w:t xml:space="preserve">$11,355</w:t>
-            </w:r>
-          </w:p>
-        </w:tc>
-        <w:tc>
-          <w:tcPr>
-            <w:vAlign w:val="center"/>
-          </w:tcPr>
-          <w:p>
-            <w:pPr>
-              <w:pStyle w:val="MdTableCell"/>
-            </w:pPr>
-            <w:r>
-              <w:t xml:space="preserve">$15,655</w:t>
-            </w:r>
-          </w:p>
-        </w:tc>
-        <w:tc>
-          <w:tcPr>
-            <w:vAlign w:val="center"/>
-          </w:tcPr>
-          <w:p>
-            <w:pPr>
-              <w:pStyle w:val="MdTableCell"/>
-            </w:pPr>
-            <w:r>
-              <w:t xml:space="preserve">$47,755</w:t>
+              <w:t xml:space="preserve">Operating expenses (incl. cross-border compliance)</w:t>
+            </w:r>
+          </w:p>
+        </w:tc>
+        <w:tc>
+          <w:tcPr>
+            <w:vAlign w:val="center"/>
+          </w:tcPr>
+          <w:p>
+            <w:pPr>
+              <w:pStyle w:val="MdTableCell"/>
+            </w:pPr>
+            <w:r>
+              <w:t xml:space="preserve">$41,000</w:t>
+            </w:r>
+          </w:p>
+        </w:tc>
+        <w:tc>
+          <w:tcPr>
+            <w:vAlign w:val="center"/>
+          </w:tcPr>
+          <w:p>
+            <w:pPr>
+              <w:pStyle w:val="MdTableCell"/>
+            </w:pPr>
+            <w:r>
+              <w:t xml:space="preserve">$212,000</w:t>
+            </w:r>
+          </w:p>
+        </w:tc>
+        <w:tc>
+          <w:tcPr>
+            <w:vAlign w:val="center"/>
+          </w:tcPr>
+          <w:p>
+            <w:pPr>
+              <w:pStyle w:val="MdTableCell"/>
+            </w:pPr>
+            <w:r>
+              <w:t xml:space="preserve">$675,000</w:t>
             </w:r>
           </w:p>
         </w:tc>
@@ -2018,7 +2132,7 @@
                 <w:b/>
                 <w:bCs/>
               </w:rPr>
-              <w:t xml:space="preserve">$56,895</w:t>
+              <w:t xml:space="preserve">$420</w:t>
             </w:r>
           </w:p>
         </w:tc>
@@ -2036,7 +2150,7 @@
                 <w:b/>
                 <w:bCs/>
               </w:rPr>
-              <w:t xml:space="preserve">$530,345</w:t>
+              <w:t xml:space="preserve">$119,360</w:t>
             </w:r>
           </w:p>
         </w:tc>
@@ -2054,7 +2168,7 @@
                 <w:b/>
                 <w:bCs/>
               </w:rPr>
-              <w:t xml:space="preserve">$1,999,745</w:t>
+              <w:t xml:space="preserve">$567,600</w:t>
             </w:r>
           </w:p>
         </w:tc>
@@ -2095,7 +2209,7 @@
                 <w:b/>
                 <w:bCs/>
               </w:rPr>
-              <w:t xml:space="preserve">65%</w:t>
+              <w:t xml:space="preserve">1%</w:t>
             </w:r>
           </w:p>
         </w:tc>
@@ -2113,7 +2227,7 @@
                 <w:b/>
                 <w:bCs/>
               </w:rPr>
-              <w:t xml:space="preserve">76%</w:t>
+              <w:t xml:space="preserve">27%</w:t>
             </w:r>
           </w:p>
         </w:tc>
@@ -2131,12 +2245,121 @@
                 <w:b/>
                 <w:bCs/>
               </w:rPr>
-              <w:t xml:space="preserve">76%</w:t>
+              <w:t xml:space="preserve">35%</w:t>
             </w:r>
           </w:p>
         </w:tc>
       </w:tr>
     </w:tbl>
+    <w:p>
+      <w:pPr>
+        <w:pStyle w:val="Heading3"/>
+        <w:pStyle w:val="MdHeading3"/>
+      </w:pPr>
+      <w:r>
+        <w:t xml:space="preserve">Taxes, fees &amp;amp; cross-border costs — how they're treated</w:t>
+      </w:r>
+    </w:p>
+    <w:p>
+      <w:pPr>
+        <w:pStyle w:val="ListParagraph"/>
+        <w:pStyle w:val="MdListItem"/>
+        <w:numPr>
+          <w:ilvl w:val="0"/>
+          <w:numId w:val="1"/>
+        </w:numPr>
+      </w:pPr>
+      <w:r>
+        <w:rPr>
+          <w:rStyle w:val="MdStrong"/>
+          <w:b/>
+          <w:bCs/>
+        </w:rPr>
+        <w:t xml:space="preserve">Owner rental taxes are pass-through, not our revenue.</w:t>
+      </w:r>
+      <w:r>
+        <w:t xml:space="preserve"> Mexican income tax (ISR), VAT (IVA 16%), and the state lodging tax (ISH ~3%) are the owner's obligation; where required, Familiar Guest withholds and remits them to SAT on the owner's behalf. They do not inflate the figures above. (US homes: owner income tax + local occupancy/TOT handled the same way.)</w:t>
+      </w:r>
+    </w:p>
+    <w:p>
+      <w:pPr>
+        <w:pStyle w:val="ListParagraph"/>
+        <w:pStyle w:val="MdListItem"/>
+        <w:numPr>
+          <w:ilvl w:val="0"/>
+          <w:numId w:val="1"/>
+        </w:numPr>
+      </w:pPr>
+      <w:r>
+        <w:rPr>
+          <w:rStyle w:val="MdStrong"/>
+          <w:b/>
+          <w:bCs/>
+        </w:rPr>
+        <w:t xml:space="preserve">IVA on our own service fee (Mexico)</w:t>
+      </w:r>
+      <w:r>
+        <w:t xml:space="preserve"> is added to the owner's invoice and remitted — net-zero to us. </w:t>
+      </w:r>
+      <w:r>
+        <w:rPr>
+          <w:rStyle w:val="MdEm"/>
+          <w:i/>
+          <w:iCs/>
+        </w:rPr>
+        <w:t xml:space="preserve">Downside risk:</w:t>
+      </w:r>
+      <w:r>
+        <w:t xml:space="preserve"> if it must be absorbed rather than passed on, it would cut ~14% from Mexico-sourced service revenue.</w:t>
+      </w:r>
+    </w:p>
+    <w:p>
+      <w:pPr>
+        <w:pStyle w:val="ListParagraph"/>
+        <w:pStyle w:val="MdListItem"/>
+        <w:numPr>
+          <w:ilvl w:val="0"/>
+          <w:numId w:val="1"/>
+        </w:numPr>
+      </w:pPr>
+      <w:r>
+        <w:rPr>
+          <w:rStyle w:val="MdStrong"/>
+          <w:b/>
+          <w:bCs/>
+        </w:rPr>
+        <w:t xml:space="preserve">Payment processing &amp;amp; currency conversion</w:t>
+      </w:r>
+      <w:r>
+        <w:t xml:space="preserve"> are passed through at cost (net-zero). A modest optional FX spread is potential upside (see v2 model), not assumed here.</w:t>
+      </w:r>
+    </w:p>
+    <w:p>
+      <w:pPr>
+        <w:pStyle w:val="ListParagraph"/>
+        <w:pStyle w:val="MdListItem"/>
+        <w:numPr>
+          <w:ilvl w:val="0"/>
+          <w:numId w:val="1"/>
+        </w:numPr>
+      </w:pPr>
+      <w:r>
+        <w:rPr>
+          <w:rStyle w:val="MdStrong"/>
+          <w:b/>
+          <w:bCs/>
+        </w:rPr>
+        <w:t xml:space="preserve">Cross-border compliance is a real cost</w:t>
+      </w:r>
+      <w:r>
+        <w:t xml:space="preserve"> — Mexican SAT registration, Mexican accounting, and withholding administration — and is carried as an explicit operating-expense line (below).</w:t>
+      </w:r>
+    </w:p>
+    <w:p>
+      <w:pPr>
+        <w:pStyle w:val="MdSpace"/>
+      </w:pPr>
+    </w:p>
     <w:p>
       <w:pPr>
         <w:pStyle w:val="Heading3"/>
@@ -2253,33 +2476,33 @@
               <w:pStyle w:val="MdTableCell"/>
             </w:pPr>
             <w:r>
-              <w:t xml:space="preserve">$555</w:t>
-            </w:r>
-          </w:p>
-        </w:tc>
-        <w:tc>
-          <w:tcPr>
-            <w:vAlign w:val="center"/>
-          </w:tcPr>
-          <w:p>
-            <w:pPr>
-              <w:pStyle w:val="MdTableCell"/>
-            </w:pPr>
-            <w:r>
-              <w:t xml:space="preserve">$855</w:t>
-            </w:r>
-          </w:p>
-        </w:tc>
-        <w:tc>
-          <w:tcPr>
-            <w:vAlign w:val="center"/>
-          </w:tcPr>
-          <w:p>
-            <w:pPr>
-              <w:pStyle w:val="MdTableCell"/>
-            </w:pPr>
-            <w:r>
-              <w:t xml:space="preserve">$2,415</w:t>
+              <w:t xml:space="preserve">$600</w:t>
+            </w:r>
+          </w:p>
+        </w:tc>
+        <w:tc>
+          <w:tcPr>
+            <w:vAlign w:val="center"/>
+          </w:tcPr>
+          <w:p>
+            <w:pPr>
+              <w:pStyle w:val="MdTableCell"/>
+            </w:pPr>
+            <w:r>
+              <w:t xml:space="preserve">$3,000</w:t>
+            </w:r>
+          </w:p>
+        </w:tc>
+        <w:tc>
+          <w:tcPr>
+            <w:vAlign w:val="center"/>
+          </w:tcPr>
+          <w:p>
+            <w:pPr>
+              <w:pStyle w:val="MdTableCell"/>
+            </w:pPr>
+            <w:r>
+              <w:t xml:space="preserve">$12,000</w:t>
             </w:r>
           </w:p>
         </w:tc>
@@ -2297,46 +2520,46 @@
               <w:pStyle w:val="MdTableCell"/>
             </w:pPr>
             <w:r>
-              <w:t xml:space="preserve">SaaS services (email, e-signatures, monitoring)</w:t>
-            </w:r>
-          </w:p>
-        </w:tc>
-        <w:tc>
-          <w:tcPr>
-            <w:vAlign w:val="center"/>
-          </w:tcPr>
-          <w:p>
-            <w:pPr>
-              <w:pStyle w:val="MdTableCell"/>
-            </w:pPr>
-            <w:r>
-              <w:t xml:space="preserve">$360</w:t>
-            </w:r>
-          </w:p>
-        </w:tc>
-        <w:tc>
-          <w:tcPr>
-            <w:vAlign w:val="center"/>
-          </w:tcPr>
-          <w:p>
-            <w:pPr>
-              <w:pStyle w:val="MdTableCell"/>
-            </w:pPr>
-            <w:r>
-              <w:t xml:space="preserve">$1,260</w:t>
-            </w:r>
-          </w:p>
-        </w:tc>
-        <w:tc>
-          <w:tcPr>
-            <w:vAlign w:val="center"/>
-          </w:tcPr>
-          <w:p>
-            <w:pPr>
-              <w:pStyle w:val="MdTableCell"/>
-            </w:pPr>
-            <w:r>
-              <w:t xml:space="preserve">$2,700</w:t>
+              <w:t xml:space="preserve">SaaS services (e-signatures, monitoring, misc)</w:t>
+            </w:r>
+          </w:p>
+        </w:tc>
+        <w:tc>
+          <w:tcPr>
+            <w:vAlign w:val="center"/>
+          </w:tcPr>
+          <w:p>
+            <w:pPr>
+              <w:pStyle w:val="MdTableCell"/>
+            </w:pPr>
+            <w:r>
+              <w:t xml:space="preserve">$900</w:t>
+            </w:r>
+          </w:p>
+        </w:tc>
+        <w:tc>
+          <w:tcPr>
+            <w:vAlign w:val="center"/>
+          </w:tcPr>
+          <w:p>
+            <w:pPr>
+              <w:pStyle w:val="MdTableCell"/>
+            </w:pPr>
+            <w:r>
+              <w:t xml:space="preserve">$4,000</w:t>
+            </w:r>
+          </w:p>
+        </w:tc>
+        <w:tc>
+          <w:tcPr>
+            <w:vAlign w:val="center"/>
+          </w:tcPr>
+          <w:p>
+            <w:pPr>
+              <w:pStyle w:val="MdTableCell"/>
+            </w:pPr>
+            <w:r>
+              <w:t xml:space="preserve">$12,000</w:t>
             </w:r>
           </w:p>
         </w:tc>
@@ -2354,46 +2577,46 @@
               <w:pStyle w:val="MdTableCell"/>
             </w:pPr>
             <w:r>
-              <w:t xml:space="preserve">AI &amp; development tools</w:t>
-            </w:r>
-          </w:p>
-        </w:tc>
-        <w:tc>
-          <w:tcPr>
-            <w:vAlign w:val="center"/>
-          </w:tcPr>
-          <w:p>
-            <w:pPr>
-              <w:pStyle w:val="MdTableCell"/>
-            </w:pPr>
-            <w:r>
-              <w:t xml:space="preserve">$1,440</w:t>
-            </w:r>
-          </w:p>
-        </w:tc>
-        <w:tc>
-          <w:tcPr>
-            <w:vAlign w:val="center"/>
-          </w:tcPr>
-          <w:p>
-            <w:pPr>
-              <w:pStyle w:val="MdTableCell"/>
-            </w:pPr>
-            <w:r>
-              <w:t xml:space="preserve">$1,440</w:t>
-            </w:r>
-          </w:p>
-        </w:tc>
-        <w:tc>
-          <w:tcPr>
-            <w:vAlign w:val="center"/>
-          </w:tcPr>
-          <w:p>
-            <w:pPr>
-              <w:pStyle w:val="MdTableCell"/>
-            </w:pPr>
-            <w:r>
-              <w:t xml:space="preserve">$1,440</w:t>
+              <w:t xml:space="preserve">AI &amp; development tools (incl. AI support/translation)</w:t>
+            </w:r>
+          </w:p>
+        </w:tc>
+        <w:tc>
+          <w:tcPr>
+            <w:vAlign w:val="center"/>
+          </w:tcPr>
+          <w:p>
+            <w:pPr>
+              <w:pStyle w:val="MdTableCell"/>
+            </w:pPr>
+            <w:r>
+              <w:t xml:space="preserve">$1,500</w:t>
+            </w:r>
+          </w:p>
+        </w:tc>
+        <w:tc>
+          <w:tcPr>
+            <w:vAlign w:val="center"/>
+          </w:tcPr>
+          <w:p>
+            <w:pPr>
+              <w:pStyle w:val="MdTableCell"/>
+            </w:pPr>
+            <w:r>
+              <w:t xml:space="preserve">$3,000</w:t>
+            </w:r>
+          </w:p>
+        </w:tc>
+        <w:tc>
+          <w:tcPr>
+            <w:vAlign w:val="center"/>
+          </w:tcPr>
+          <w:p>
+            <w:pPr>
+              <w:pStyle w:val="MdTableCell"/>
+            </w:pPr>
+            <w:r>
+              <w:t xml:space="preserve">$8,000</w:t>
             </w:r>
           </w:p>
         </w:tc>
@@ -2411,46 +2634,46 @@
               <w:pStyle w:val="MdTableCell"/>
             </w:pPr>
             <w:r>
-              <w:t xml:space="preserve">Professional services (contract dev, legal, insurance)</w:t>
-            </w:r>
-          </w:p>
-        </w:tc>
-        <w:tc>
-          <w:tcPr>
-            <w:vAlign w:val="center"/>
-          </w:tcPr>
-          <w:p>
-            <w:pPr>
-              <w:pStyle w:val="MdTableCell"/>
-            </w:pPr>
-            <w:r>
-              <w:t xml:space="preserve">$8,500</w:t>
-            </w:r>
-          </w:p>
-        </w:tc>
-        <w:tc>
-          <w:tcPr>
-            <w:vAlign w:val="center"/>
-          </w:tcPr>
-          <w:p>
-            <w:pPr>
-              <w:pStyle w:val="MdTableCell"/>
-            </w:pPr>
-            <w:r>
-              <w:t xml:space="preserve">$6,500</w:t>
-            </w:r>
-          </w:p>
-        </w:tc>
-        <w:tc>
-          <w:tcPr>
-            <w:vAlign w:val="center"/>
-          </w:tcPr>
-          <w:p>
-            <w:pPr>
-              <w:pStyle w:val="MdTableCell"/>
-            </w:pPr>
-            <w:r>
-              <w:t xml:space="preserve">$11,000</w:t>
+              <w:t xml:space="preserve">Professional services (contract dev, legal, insurance, accounting)</w:t>
+            </w:r>
+          </w:p>
+        </w:tc>
+        <w:tc>
+          <w:tcPr>
+            <w:vAlign w:val="center"/>
+          </w:tcPr>
+          <w:p>
+            <w:pPr>
+              <w:pStyle w:val="MdTableCell"/>
+            </w:pPr>
+            <w:r>
+              <w:t xml:space="preserve">$12,000</w:t>
+            </w:r>
+          </w:p>
+        </w:tc>
+        <w:tc>
+          <w:tcPr>
+            <w:vAlign w:val="center"/>
+          </w:tcPr>
+          <w:p>
+            <w:pPr>
+              <w:pStyle w:val="MdTableCell"/>
+            </w:pPr>
+            <w:r>
+              <w:t xml:space="preserve">$20,000</w:t>
+            </w:r>
+          </w:p>
+        </w:tc>
+        <w:tc>
+          <w:tcPr>
+            <w:vAlign w:val="center"/>
+          </w:tcPr>
+          <w:p>
+            <w:pPr>
+              <w:pStyle w:val="MdTableCell"/>
+            </w:pPr>
+            <w:r>
+              <w:t xml:space="preserve">$40,000</w:t>
             </w:r>
           </w:p>
         </w:tc>
@@ -2468,46 +2691,54 @@
               <w:pStyle w:val="MdTableCell"/>
             </w:pPr>
             <w:r>
-              <w:t xml:space="preserve">Marketing &amp; acquisition</w:t>
-            </w:r>
-          </w:p>
-        </w:tc>
-        <w:tc>
-          <w:tcPr>
-            <w:vAlign w:val="center"/>
-          </w:tcPr>
-          <w:p>
-            <w:pPr>
-              <w:pStyle w:val="MdTableCell"/>
-            </w:pPr>
-            <w:r>
-              <w:t xml:space="preserve">$500</w:t>
-            </w:r>
-          </w:p>
-        </w:tc>
-        <w:tc>
-          <w:tcPr>
-            <w:vAlign w:val="center"/>
-          </w:tcPr>
-          <w:p>
-            <w:pPr>
-              <w:pStyle w:val="MdTableCell"/>
-            </w:pPr>
-            <w:r>
-              <w:t xml:space="preserve">$5,000</w:t>
-            </w:r>
-          </w:p>
-        </w:tc>
-        <w:tc>
-          <w:tcPr>
-            <w:vAlign w:val="center"/>
-          </w:tcPr>
-          <w:p>
-            <w:pPr>
-              <w:pStyle w:val="MdTableCell"/>
-            </w:pPr>
-            <w:r>
-              <w:t xml:space="preserve">$14,000</w:t>
+              <w:rPr>
+                <w:rStyle w:val="MdStrong"/>
+                <w:b/>
+                <w:bCs/>
+              </w:rPr>
+              <w:t xml:space="preserve">Cross-border tax &amp; compliance</w:t>
+            </w:r>
+            <w:r>
+              <w:t xml:space="preserve"> (MX SAT/RFC, Mexican accounting, withholding admin)</w:t>
+            </w:r>
+          </w:p>
+        </w:tc>
+        <w:tc>
+          <w:tcPr>
+            <w:vAlign w:val="center"/>
+          </w:tcPr>
+          <w:p>
+            <w:pPr>
+              <w:pStyle w:val="MdTableCell"/>
+            </w:pPr>
+            <w:r>
+              <w:t xml:space="preserve">$6,000</w:t>
+            </w:r>
+          </w:p>
+        </w:tc>
+        <w:tc>
+          <w:tcPr>
+            <w:vAlign w:val="center"/>
+          </w:tcPr>
+          <w:p>
+            <w:pPr>
+              <w:pStyle w:val="MdTableCell"/>
+            </w:pPr>
+            <w:r>
+              <w:t xml:space="preserve">$15,000</w:t>
+            </w:r>
+          </w:p>
+        </w:tc>
+        <w:tc>
+          <w:tcPr>
+            <w:vAlign w:val="center"/>
+          </w:tcPr>
+          <w:p>
+            <w:pPr>
+              <w:pStyle w:val="MdTableCell"/>
+            </w:pPr>
+            <w:r>
+              <w:t xml:space="preserve">$35,000</w:t>
             </w:r>
           </w:p>
         </w:tc>
@@ -2525,46 +2756,103 @@
               <w:pStyle w:val="MdTableCell"/>
             </w:pPr>
             <w:r>
-              <w:t xml:space="preserve">Customer support</w:t>
-            </w:r>
-          </w:p>
-        </w:tc>
-        <w:tc>
-          <w:tcPr>
-            <w:vAlign w:val="center"/>
-          </w:tcPr>
-          <w:p>
-            <w:pPr>
-              <w:pStyle w:val="MdTableCell"/>
-            </w:pPr>
-            <w:r>
-              <w:t xml:space="preserve">$0</w:t>
-            </w:r>
-          </w:p>
-        </w:tc>
-        <w:tc>
-          <w:tcPr>
-            <w:vAlign w:val="center"/>
-          </w:tcPr>
-          <w:p>
-            <w:pPr>
-              <w:pStyle w:val="MdTableCell"/>
-            </w:pPr>
-            <w:r>
-              <w:t xml:space="preserve">$600</w:t>
-            </w:r>
-          </w:p>
-        </w:tc>
-        <w:tc>
-          <w:tcPr>
-            <w:vAlign w:val="center"/>
-          </w:tcPr>
-          <w:p>
-            <w:pPr>
-              <w:pStyle w:val="MdTableCell"/>
-            </w:pPr>
-            <w:r>
-              <w:t xml:space="preserve">$16,200</w:t>
+              <w:t xml:space="preserve">Marketing &amp; acquisition</w:t>
+            </w:r>
+          </w:p>
+        </w:tc>
+        <w:tc>
+          <w:tcPr>
+            <w:vAlign w:val="center"/>
+          </w:tcPr>
+          <w:p>
+            <w:pPr>
+              <w:pStyle w:val="MdTableCell"/>
+            </w:pPr>
+            <w:r>
+              <w:t xml:space="preserve">$5,000</w:t>
+            </w:r>
+          </w:p>
+        </w:tc>
+        <w:tc>
+          <w:tcPr>
+            <w:vAlign w:val="center"/>
+          </w:tcPr>
+          <w:p>
+            <w:pPr>
+              <w:pStyle w:val="MdTableCell"/>
+            </w:pPr>
+            <w:r>
+              <w:t xml:space="preserve">$35,000</w:t>
+            </w:r>
+          </w:p>
+        </w:tc>
+        <w:tc>
+          <w:tcPr>
+            <w:vAlign w:val="center"/>
+          </w:tcPr>
+          <w:p>
+            <w:pPr>
+              <w:pStyle w:val="MdTableCell"/>
+            </w:pPr>
+            <w:r>
+              <w:t xml:space="preserve">$100,000</w:t>
+            </w:r>
+          </w:p>
+        </w:tc>
+      </w:tr>
+      <w:tr>
+        <w:trPr>
+          <w:cantSplit/>
+        </w:trPr>
+        <w:tc>
+          <w:tcPr>
+            <w:vAlign w:val="center"/>
+          </w:tcPr>
+          <w:p>
+            <w:pPr>
+              <w:pStyle w:val="MdTableCell"/>
+            </w:pPr>
+            <w:r>
+              <w:t xml:space="preserve">Customer support (AI-deflected + nearshore)</w:t>
+            </w:r>
+          </w:p>
+        </w:tc>
+        <w:tc>
+          <w:tcPr>
+            <w:vAlign w:val="center"/>
+          </w:tcPr>
+          <w:p>
+            <w:pPr>
+              <w:pStyle w:val="MdTableCell"/>
+            </w:pPr>
+            <w:r>
+              <w:t xml:space="preserve">$15,000</w:t>
+            </w:r>
+          </w:p>
+        </w:tc>
+        <w:tc>
+          <w:tcPr>
+            <w:vAlign w:val="center"/>
+          </w:tcPr>
+          <w:p>
+            <w:pPr>
+              <w:pStyle w:val="MdTableCell"/>
+            </w:pPr>
+            <w:r>
+              <w:t xml:space="preserve">$132,000</w:t>
+            </w:r>
+          </w:p>
+        </w:tc>
+        <w:tc>
+          <w:tcPr>
+            <w:vAlign w:val="center"/>
+          </w:tcPr>
+          <w:p>
+            <w:pPr>
+              <w:pStyle w:val="MdTableCell"/>
+            </w:pPr>
+            <w:r>
+              <w:t xml:space="preserve">$468,000</w:t>
             </w:r>
           </w:p>
         </w:tc>
@@ -2605,7 +2893,7 @@
                 <w:b/>
                 <w:bCs/>
               </w:rPr>
-              <w:t xml:space="preserve">$11,355</w:t>
+              <w:t xml:space="preserve">$41,000</w:t>
             </w:r>
           </w:p>
         </w:tc>
@@ -2623,7 +2911,7 @@
                 <w:b/>
                 <w:bCs/>
               </w:rPr>
-              <w:t xml:space="preserve">$15,655</w:t>
+              <w:t xml:space="preserve">$212,000</w:t>
             </w:r>
           </w:p>
         </w:tc>
@@ -2641,7 +2929,7 @@
                 <w:b/>
                 <w:bCs/>
               </w:rPr>
-              <w:t xml:space="preserve">$47,755</w:t>
+              <w:t xml:space="preserve">$675,000</w:t>
             </w:r>
           </w:p>
         </w:tc>
@@ -2656,7 +2944,7 @@
       </w:r>
       <w:r>
         <w:br/>
-        <w:t xml:space="preserve">&lt;p&gt;&lt;strong&gt;Profitable from Year 1.&lt;/strong&gt; No external funding required. Total operating expenses across three years sum to approximately $75,000. If capital is pursued, it would be for growth acceleration — not survival.&lt;/p&gt;</w:t>
+        <w:t xml:space="preserve">&lt;p&gt;&lt;strong&gt;Roughly breakeven in Year 1, solidly profitable in Years 2–3.&lt;/strong&gt; Customer support is the dominant cost at scale — held sublinear with AI-first, nearshore support. A small buffer (covering Year-1 legal, Mexican compliance setup, and support ramp) is prudent, but no large raise is required. The biggest swing factor remains support cost per owner.&lt;/p&gt;</w:t>
       </w:r>
       <w:r>
         <w:br/>
@@ -2682,7 +2970,7 @@
         </w:numPr>
       </w:pPr>
       <w:r>
-        <w:t xml:space="preserve">Blended ARPU of ~$218/active owner/year (mix of 5% commission and the $15 Starter / $29 Host / $49 Pro plans, weighted toward casual owners). See the v2 financial model for the full re-projection. Revisit as the plan mix is validated with real owners.</w:t>
+        <w:t xml:space="preserve">Blended ARPU of ~$218/active owner/year (mix of 5% commission and the $15 Starter / $29 Host / $49 Pro plans). Mix and ARPU to be validated with real owners; a Host-leaning mix would raise ARPU.</w:t>
       </w:r>
     </w:p>
     <w:p>
@@ -2695,7 +2983,7 @@
         </w:numPr>
       </w:pPr>
       <w:r>
-        <w:t xml:space="preserve">78% gross margin after Stripe platform fees, hosting, and third-party APIs</w:t>
+        <w:t xml:space="preserve">76% gross margin after Stripe platform fees, hosting, third-party APIs, and cross-border payment/vendor costs.</w:t>
       </w:r>
     </w:p>
     <w:p>
@@ -2708,7 +2996,7 @@
         </w:numPr>
       </w:pPr>
       <w:r>
-        <w:t xml:space="preserve">Growth driven by low-friction onboarding and owner/guest referrals; modest paid marketing begins in Year 2</w:t>
+        <w:t xml:space="preserve">Mexican rental taxes (ISR/IVA/ISH) and US occupancy taxes are pass-through (not revenue); cross-border compliance is carried as an explicit OpEx line.</w:t>
       </w:r>
     </w:p>
     <w:p>
@@ -2721,52 +3009,7 @@
         </w:numPr>
       </w:pPr>
       <w:r>
-        <w:t xml:space="preserve">First hire (part-time support) in Year 3 as owner base crosses ~5,000</w:t>
-      </w:r>
-    </w:p>
-    <w:p>
-      <w:pPr>
-        <w:pStyle w:val="MdSpace"/>
-      </w:pPr>
-    </w:p>
-    <w:p>
-      <w:pPr>
-        <w:pStyle w:val="MdParagraph"/>
-      </w:pPr>
-      <w:r>
-        <w:rPr>
-          <w:rStyle w:val="MdEm"/>
-          <w:i/>
-          <w:iCs/>
-        </w:rPr>
-        <w:t xml:space="preserve">These are illustrative projections, not guarantees. Results depend on owner acquisition and retention.</w:t>
-      </w:r>
-    </w:p>
-    <w:p>
-      <w:pPr>
-        <w:pStyle w:val="MdSpace"/>
-      </w:pPr>
-    </w:p>
-    <w:p>
-      <w:pPr>
-        <w:pStyle w:val="MdHr"/>
-        <w:pBdr>
-          <w:bottom w:val="single" w:color="auto" w:sz="6" w:space="1"/>
-        </w:pBdr>
-      </w:pPr>
-    </w:p>
-    <w:p>
-      <w:pPr>
-        <w:pStyle w:val="MdSpace"/>
-      </w:pPr>
-    </w:p>
-    <w:p>
-      <w:pPr>
-        <w:pStyle w:val="Heading2"/>
-        <w:pStyle w:val="MdHeading2"/>
-      </w:pPr>
-      <w:r>
-        <w:t xml:space="preserve">Risks — Honest Assessment</w:t>
+        <w:t xml:space="preserve">Customer support is the largest cost at scale — held sublinear via AI-first deflection + nearshore (Mexico) support; growth driven mainly by referrals.</w:t>
       </w:r>
     </w:p>
     <w:p>
@@ -2779,6 +3022,64 @@
         </w:numPr>
       </w:pPr>
       <w:r>
+        <w:t xml:space="preserve">Revenue calculated on average active owners per year.</w:t>
+      </w:r>
+    </w:p>
+    <w:p>
+      <w:pPr>
+        <w:pStyle w:val="MdSpace"/>
+      </w:pPr>
+    </w:p>
+    <w:p>
+      <w:pPr>
+        <w:pStyle w:val="MdParagraph"/>
+      </w:pPr>
+      <w:r>
+        <w:rPr>
+          <w:rStyle w:val="MdEm"/>
+          <w:i/>
+          <w:iCs/>
+        </w:rPr>
+        <w:t xml:space="preserve">Illustrative projections, not guarantees. The Mexican tax/withholding structure and the plan mix must be validated with counsel and real owners; both can move these numbers materially.</w:t>
+      </w:r>
+    </w:p>
+    <w:p>
+      <w:pPr>
+        <w:pStyle w:val="MdSpace"/>
+      </w:pPr>
+    </w:p>
+    <w:p>
+      <w:pPr>
+        <w:pStyle w:val="MdHr"/>
+        <w:pBdr>
+          <w:bottom w:val="single" w:color="auto" w:sz="6" w:space="1"/>
+        </w:pBdr>
+      </w:pPr>
+    </w:p>
+    <w:p>
+      <w:pPr>
+        <w:pStyle w:val="MdSpace"/>
+      </w:pPr>
+    </w:p>
+    <w:p>
+      <w:pPr>
+        <w:pStyle w:val="Heading2"/>
+        <w:pStyle w:val="MdHeading2"/>
+      </w:pPr>
+      <w:r>
+        <w:t xml:space="preserve">Risks — Honest Assessment</w:t>
+      </w:r>
+    </w:p>
+    <w:p>
+      <w:pPr>
+        <w:pStyle w:val="ListParagraph"/>
+        <w:pStyle w:val="MdListItem"/>
+        <w:numPr>
+          <w:ilvl w:val="0"/>
+          <w:numId w:val="1"/>
+        </w:numPr>
+      </w:pPr>
+      <w:r>
         <w:rPr>
           <w:rStyle w:val="MdStrong"/>
           <w:b/>
@@ -2830,6 +3131,48 @@
       </w:r>
       <w:r>
         <w:t xml:space="preserve"> The differentiation rests on escrow, verification, and screening working flawlessly. A single high-profile failure would undercut the core promise.</w:t>
+      </w:r>
+    </w:p>
+    <w:p>
+      <w:pPr>
+        <w:pStyle w:val="ListParagraph"/>
+        <w:pStyle w:val="MdListItem"/>
+        <w:numPr>
+          <w:ilvl w:val="0"/>
+          <w:numId w:val="1"/>
+        </w:numPr>
+      </w:pPr>
+      <w:r>
+        <w:rPr>
+          <w:rStyle w:val="MdStrong"/>
+          <w:b/>
+          <w:bCs/>
+        </w:rPr>
+        <w:t xml:space="preserve">Cross-border tax exposure.</w:t>
+      </w:r>
+      <w:r>
+        <w:t xml:space="preserve"> Mexico may require Familiar Guest to register with SAT and withhold/remit ISR and IVA on host earnings as a digital platform. This must be resolved with Mexican counsel before live Mexican payments; it can affect structure, cost, and timing.</w:t>
+      </w:r>
+    </w:p>
+    <w:p>
+      <w:pPr>
+        <w:pStyle w:val="ListParagraph"/>
+        <w:pStyle w:val="MdListItem"/>
+        <w:numPr>
+          <w:ilvl w:val="0"/>
+          <w:numId w:val="1"/>
+        </w:numPr>
+      </w:pPr>
+      <w:r>
+        <w:rPr>
+          <w:rStyle w:val="MdStrong"/>
+          <w:b/>
+          <w:bCs/>
+        </w:rPr>
+        <w:t xml:space="preserve">Support cost at scale.</w:t>
+      </w:r>
+      <w:r>
+        <w:t xml:space="preserve"> A money-handling, cross-border product is support-heavy; if support scales linearly with owners it can erode margin. Mitigated by AI-first deflection and nearshore support.</w:t>
       </w:r>
     </w:p>
     <w:p>

</xml_diff>

<commit_message>
Add Tax Payments & Accounting as a core differentiator
- New core positioning pillar + dedicated feature section: FG handles
  lodging-tax calc/collection/remittance, Mexican host-tax withholding
  (SAT), and tax-ready accounting/exports across units — handling +
  reporting, NOT tax advice; phased and counsel-gated
- Reframed the earlier "no tax helper" exclusion accordingly
- Added to solution design (features->value), competitive assessment
  (head-to-head: none offer it), product feature brief (section J +
  launch scope), business brief ("our lane"), product sheet & brochure
  benefit lines
- Regenerated affected PDFs and Word docs

Co-Authored-By: Claude Opus 4.6 <noreply@anthropic.com>
</commit_message>
<xml_diff>
--- a/docs/business/Familiar_Guest_Business_Brief.docx
+++ b/docs/business/Familiar_Guest_Business_Brief.docx
@@ -91,7 +91,7 @@
       <w:r>
         <w:t xml:space="preserve">stylesheet: </w:t>
       </w:r>
-      <w:hyperlink w:history="1" r:id="rId0ihziju4sncepldrsblo7">
+      <w:hyperlink w:history="1" r:id="rIdixuf1xgqeucbqpg146cnz">
         <w:r>
           <w:rPr>
             <w:rStyle w:val="MdLink"/>
@@ -1600,7 +1600,18 @@
         <w:t xml:space="preserve">Our lane:</w:t>
       </w:r>
       <w:r>
-        <w:t xml:space="preserve"> effortless setup, repeat-guest focus, and trust built in by default. No incumbent owns all three.</w:t>
+        <w:t xml:space="preserve"> effortless setup, repeat-guest focus, trust built in by default, and </w:t>
+      </w:r>
+      <w:r>
+        <w:rPr>
+          <w:rStyle w:val="MdStrong"/>
+          <w:b/>
+          <w:bCs/>
+        </w:rPr>
+        <w:t xml:space="preserve">cross-border tax payments &amp;amp; accounting handled for the owner</w:t>
+      </w:r>
+      <w:r>
+        <w:t xml:space="preserve"> — a combination no incumbent offers.</w:t>
       </w:r>
     </w:p>
     <w:p>

</xml_diff>

<commit_message>
Rename tax feature, add Split Payments, rename escrow feature
- "Tax Payments & Accounting" -> "Rental Income & Tax Payment
  Accounting" (adds income tracking + documents for tax reporting);
  renamed across brochure, CLAUDE.md, solution design, product feature
  brief, competitive assessment, business brief
- "Escrow-Protected Payments" -> "Escrow-Protected Deposits & Payments"
- Added Split Payments as its own feature (deposit now, balance before
  arrival); brochure features page now a clean 2-column, 10-feature grid
- Regenerated affected PDFs and Word docs

Co-Authored-By: Claude Opus 4.6 <noreply@anthropic.com>
</commit_message>
<xml_diff>
--- a/docs/business/Familiar_Guest_Business_Brief.docx
+++ b/docs/business/Familiar_Guest_Business_Brief.docx
@@ -91,7 +91,7 @@
       <w:r>
         <w:t xml:space="preserve">stylesheet: </w:t>
       </w:r>
-      <w:hyperlink w:history="1" r:id="rIdixuf1xgqeucbqpg146cnz">
+      <w:hyperlink w:history="1" r:id="rIdfmh05x8ub8gziro1bzq0i">
         <w:r>
           <w:rPr>
             <w:rStyle w:val="MdLink"/>
@@ -1608,7 +1608,7 @@
           <w:b/>
           <w:bCs/>
         </w:rPr>
-        <w:t xml:space="preserve">cross-border tax payments &amp;amp; accounting handled for the owner</w:t>
+        <w:t xml:space="preserve">rental-income &amp;amp; tax accounting handled for the owner</w:t>
       </w:r>
       <w:r>
         <w:t xml:space="preserve"> — a combination no incumbent offers.</w:t>

</xml_diff>